<commit_message>
feat: implement e-approval module with PDF signing, documentation, and engine logic
</commit_message>
<xml_diff>
--- a/docs/E-Approval-Manual.docx
+++ b/docs/E-Approval-Manual.docx
@@ -55,7 +55,7 @@
           <w:sz w:val="18"/>
           <w:szCs w:val="18"/>
         </w:rPr>
-        <w:t xml:space="preserve">Version 1.0  ·  28 August 2026</w:t>
+        <w:t xml:space="preserve">Version 1.0  ·  2 September 2026</w:t>
       </w:r>
     </w:p>
     <w:p>
@@ -301,6 +301,35 @@
           <w:szCs w:val="18"/>
         </w:rPr>
         <w:t xml:space="preserve"> — What can be added, edited and removed — and what cannot.</w:t>
+      </w:r>
+    </w:p>
+    <w:p>
+      <w:pPr>
+        <w:spacing w:after="20"/>
+        <w:ind w:left="340" w:hanging="340"/>
+      </w:pPr>
+      <w:r>
+        <w:rPr>
+          <w:color w:val="64748B"/>
+          <w:sz w:val="19"/>
+          <w:szCs w:val="19"/>
+        </w:rPr>
+        <w:t xml:space="preserve">1.8</w:t>
+      </w:r>
+      <w:r>
+        <w:rPr>
+          <w:sz w:val="19"/>
+          <w:szCs w:val="19"/>
+        </w:rPr>
+        <w:t xml:space="preserve">  Signing a document</w:t>
+      </w:r>
+      <w:r>
+        <w:rPr>
+          <w:color w:val="94A3B8"/>
+          <w:sz w:val="18"/>
+          <w:szCs w:val="18"/>
+        </w:rPr>
+        <w:t xml:space="preserve"> — Draw or upload your signature once, then stamp it onto any PDF attachment.</w:t>
       </w:r>
     </w:p>
     <w:p>
@@ -1562,6 +1591,45 @@
                 <w:sz w:val="19"/>
                 <w:szCs w:val="19"/>
               </w:rPr>
+              <w:t xml:space="preserve">My Activity</w:t>
+            </w:r>
+          </w:p>
+        </w:tc>
+        <w:tc>
+          <w:tcPr>
+            <w:tcW w:w="6747" w:type="dxa"/>
+            <w:vAlign w:val="top"/>
+          </w:tcPr>
+          <w:p>
+            <w:pPr>
+              <w:spacing w:before="40" w:after="40"/>
+            </w:pPr>
+            <w:r>
+              <w:rPr>
+                <w:sz w:val="19"/>
+                <w:szCs w:val="19"/>
+              </w:rPr>
+              <w:t xml:space="preserve">Everything you have personally done — approved, verified, returned and the rest — across every approval.</w:t>
+            </w:r>
+          </w:p>
+        </w:tc>
+      </w:tr>
+      <w:tr>
+        <w:tc>
+          <w:tcPr>
+            <w:tcW w:w="2891" w:type="dxa"/>
+            <w:vAlign w:val="top"/>
+          </w:tcPr>
+          <w:p>
+            <w:pPr>
+              <w:spacing w:before="40" w:after="40"/>
+            </w:pPr>
+            <w:r>
+              <w:rPr>
+                <w:b/>
+                <w:sz w:val="19"/>
+                <w:szCs w:val="19"/>
+              </w:rPr>
               <w:t xml:space="preserve">Department Inbox</w:t>
             </w:r>
           </w:p>
@@ -2724,6 +2792,156 @@
     </w:p>
     <w:p>
       <w:pPr>
+        <w:pStyle w:val="Heading2"/>
+        <w:keepNext/>
+        <w:spacing w:before="280" w:after="60"/>
+      </w:pPr>
+      <w:r>
+        <w:rPr>
+          <w:color w:val="64748B"/>
+        </w:rPr>
+        <w:t xml:space="preserve">1.8   </w:t>
+      </w:r>
+      <w:r>
+        <w:t xml:space="preserve">Signing a document</w:t>
+      </w:r>
+    </w:p>
+    <w:p>
+      <w:pPr>
+        <w:keepNext/>
+        <w:spacing w:after="140"/>
+      </w:pPr>
+      <w:r>
+        <w:rPr>
+          <w:i/>
+          <w:color w:val="475569"/>
+          <w:sz w:val="19"/>
+          <w:szCs w:val="19"/>
+        </w:rPr>
+        <w:t xml:space="preserve">Draw or upload your signature once, then stamp it onto any PDF attachment.</w:t>
+      </w:r>
+    </w:p>
+    <w:p>
+      <w:pPr>
+        <w:spacing w:after="120"/>
+      </w:pPr>
+      <w:r>
+        <w:t xml:space="preserve">Open the Attachments tab and choose Sign on any PDF. The first time, you will be asked to draw your signature with a finger, stylus or mouse, or upload an image of it — it is saved and reused automatically from then on.</w:t>
+      </w:r>
+    </w:p>
+    <w:p>
+      <w:pPr>
+        <w:spacing w:after="60"/>
+        <w:ind w:left="400" w:hanging="280"/>
+      </w:pPr>
+      <w:r>
+        <w:rPr>
+          <w:b/>
+        </w:rPr>
+        <w:t xml:space="preserve">1.</w:t>
+      </w:r>
+      <w:r>
+        <w:t xml:space="preserve">  Choose which page to sign.</w:t>
+      </w:r>
+    </w:p>
+    <w:p>
+      <w:pPr>
+        <w:spacing w:after="60"/>
+        <w:ind w:left="400" w:hanging="280"/>
+      </w:pPr>
+      <w:r>
+        <w:rPr>
+          <w:b/>
+        </w:rPr>
+        <w:t xml:space="preserve">2.</w:t>
+      </w:r>
+      <w:r>
+        <w:t xml:space="preserve">  Choose roughly where on the page — one of nine positions (corners, edges or centre) — and how large.</w:t>
+      </w:r>
+    </w:p>
+    <w:p>
+      <w:pPr>
+        <w:spacing w:after="60"/>
+        <w:ind w:left="400" w:hanging="280"/>
+      </w:pPr>
+      <w:r>
+        <w:rPr>
+          <w:b/>
+        </w:rPr>
+        <w:t xml:space="preserve">3.</w:t>
+      </w:r>
+      <w:r>
+        <w:t xml:space="preserve">  Optionally fine-tune the exact spot.</w:t>
+      </w:r>
+    </w:p>
+    <w:p>
+      <w:pPr>
+        <w:spacing w:after="60"/>
+        <w:ind w:left="400" w:hanging="280"/>
+      </w:pPr>
+      <w:r>
+        <w:rPr>
+          <w:b/>
+        </w:rPr>
+        <w:t xml:space="preserve">4.</w:t>
+      </w:r>
+      <w:r>
+        <w:t xml:space="preserve">  Sign &amp; save.</w:t>
+      </w:r>
+    </w:p>
+    <w:p>
+      <w:pPr>
+        <w:spacing w:after="60"/>
+      </w:pPr>
+    </w:p>
+    <w:p>
+      <w:pPr>
+        <w:pBdr>
+          <w:left w:val="single" w:sz="18" w:space="8" w:color="38BDF8"/>
+        </w:pBdr>
+        <w:shd w:val="clear" w:color="auto" w:fill="F0F9FF"/>
+        <w:spacing w:before="80" w:after="140"/>
+        <w:ind w:left="170"/>
+      </w:pPr>
+      <w:r>
+        <w:rPr>
+          <w:b/>
+          <w:color w:val="0369A1"/>
+        </w:rPr>
+        <w:t xml:space="preserve">Note   </w:t>
+      </w:r>
+      <w:r>
+        <w:rPr>
+          <w:color w:val="0C4A6E"/>
+        </w:rPr>
+        <w:t xml:space="preserve">Signing creates a new, signed copy of the document. The original you uploaded is never changed, and stays on the record exactly as it was.</w:t>
+      </w:r>
+    </w:p>
+    <w:p>
+      <w:pPr>
+        <w:pBdr>
+          <w:left w:val="single" w:sz="18" w:space="8" w:color="F59E0B"/>
+        </w:pBdr>
+        <w:shd w:val="clear" w:color="auto" w:fill="FFFBEB"/>
+        <w:spacing w:before="80" w:after="140"/>
+        <w:ind w:left="170"/>
+      </w:pPr>
+      <w:r>
+        <w:rPr>
+          <w:b/>
+          <w:color w:val="B45309"/>
+        </w:rPr>
+        <w:t xml:space="preserve">Important   </w:t>
+      </w:r>
+      <w:r>
+        <w:rPr>
+          <w:color w:val="7C2D12"/>
+        </w:rPr>
+        <w:t xml:space="preserve">This is a visual signature — a scanned mark, the same as signing a paper note-sheet by hand. It is not a certificate-backed digital signature (a DSC). If your organisation needs a legally-binding cryptographic signature, that requires a licensed signing provider and is outside what this module does.</w:t>
+      </w:r>
+    </w:p>
+    <w:p>
+      <w:pPr>
         <w:pStyle w:val="Heading1"/>
         <w:keepNext/>
         <w:spacing w:before="400" w:after="80"/>
@@ -3392,6 +3610,45 @@
                 <w:szCs w:val="19"/>
               </w:rPr>
               <w:t xml:space="preserve">Claim a step addressed to your department, so it is yours alone.</w:t>
+            </w:r>
+          </w:p>
+        </w:tc>
+      </w:tr>
+      <w:tr>
+        <w:tc>
+          <w:tcPr>
+            <w:tcW w:w="2891" w:type="dxa"/>
+            <w:vAlign w:val="top"/>
+          </w:tcPr>
+          <w:p>
+            <w:pPr>
+              <w:spacing w:before="40" w:after="40"/>
+            </w:pPr>
+            <w:r>
+              <w:rPr>
+                <w:b/>
+                <w:sz w:val="19"/>
+                <w:szCs w:val="19"/>
+              </w:rPr>
+              <w:t xml:space="preserve">Assign to</w:t>
+            </w:r>
+          </w:p>
+        </w:tc>
+        <w:tc>
+          <w:tcPr>
+            <w:tcW w:w="6747" w:type="dxa"/>
+            <w:vAlign w:val="top"/>
+          </w:tcPr>
+          <w:p>
+            <w:pPr>
+              <w:spacing w:before="40" w:after="40"/>
+            </w:pPr>
+            <w:r>
+              <w:rPr>
+                <w:sz w:val="19"/>
+                <w:szCs w:val="19"/>
+              </w:rPr>
+              <w:t xml:space="preserve">Department heads only. Hand a file addressed to your department to a named member — or move it from one member to another. It stays on the department’s record.</w:t>
             </w:r>
           </w:p>
         </w:tc>
@@ -4996,7 +5253,7 @@
                 <w:sz w:val="19"/>
                 <w:szCs w:val="19"/>
               </w:rPr>
-              <w:t xml:space="preserve">Held for the head to assign to somebody.</w:t>
+              <w:t xml:space="preserve">Held for the head, who uses Assign to hand it to a member. Members cannot claim it themselves.</w:t>
             </w:r>
           </w:p>
         </w:tc>
@@ -6267,6 +6524,21 @@
       </w:r>
       <w:r>
         <w:t xml:space="preserve">  No other module yet routes its approvals through this engine, though it is built to accept them.</w:t>
+      </w:r>
+    </w:p>
+    <w:p>
+      <w:pPr>
+        <w:spacing w:after="60"/>
+        <w:ind w:left="400" w:hanging="280"/>
+      </w:pPr>
+      <w:r>
+        <w:rPr>
+          <w:b/>
+        </w:rPr>
+        <w:t xml:space="preserve">•</w:t>
+      </w:r>
+      <w:r>
+        <w:t xml:space="preserve">  Signing a document places a visual mark, not a certificate-backed digital signature (DSC) — see 1.8.</w:t>
       </w:r>
     </w:p>
     <w:p>

</xml_diff>

<commit_message>
docs: add technical documentation and developer handbook for E-Approval system
</commit_message>
<xml_diff>
--- a/docs/E-Approval-Manual.docx
+++ b/docs/E-Approval-Manual.docx
@@ -2826,7 +2826,15 @@
         <w:spacing w:after="120"/>
       </w:pPr>
       <w:r>
-        <w:t xml:space="preserve">Open the Attachments tab and choose Sign on any PDF. The first time, you will be asked to draw your signature with a finger, stylus or mouse, or upload an image of it — it is saved and reused automatically from then on.</w:t>
+        <w:t xml:space="preserve">Set your signature up once from My Activity — draw it with a finger, stylus or mouse, or upload an image of it — and it is ready from then on. If you have not set one up yet, opening Sign on a document offers the same drawing screen there and then.</w:t>
+      </w:r>
+    </w:p>
+    <w:p>
+      <w:pPr>
+        <w:spacing w:after="120"/>
+      </w:pPr>
+      <w:r>
+        <w:t xml:space="preserve">To actually sign a document: open the Attachments tab and choose Sign on any PDF.</w:t>
       </w:r>
     </w:p>
     <w:p>

</xml_diff>

<commit_message>
feat: implement e-approval service module with workflow state management and audit logging
</commit_message>
<xml_diff>
--- a/docs/E-Approval-Manual.docx
+++ b/docs/E-Approval-Manual.docx
@@ -421,7 +421,7 @@
           <w:sz w:val="19"/>
           <w:szCs w:val="19"/>
         </w:rPr>
-        <w:t xml:space="preserve">  When you are asked to verify</w:t>
+        <w:t xml:space="preserve">  Approving a different amount</w:t>
       </w:r>
       <w:r>
         <w:rPr>
@@ -429,7 +429,7 @@
           <w:sz w:val="18"/>
           <w:szCs w:val="18"/>
         </w:rPr>
-        <w:t xml:space="preserve"> — Three possible answers, and what each one does.</w:t>
+        <w:t xml:space="preserve"> — You are not limited to the figure you were asked to approve.</w:t>
       </w:r>
     </w:p>
     <w:p>
@@ -450,7 +450,7 @@
           <w:sz w:val="19"/>
           <w:szCs w:val="19"/>
         </w:rPr>
-        <w:t xml:space="preserve">  Deadlines and reminders</w:t>
+        <w:t xml:space="preserve">  When you are asked to verify</w:t>
       </w:r>
       <w:r>
         <w:rPr>
@@ -458,7 +458,7 @@
           <w:sz w:val="18"/>
           <w:szCs w:val="18"/>
         </w:rPr>
-        <w:t xml:space="preserve"> — How the clock works, and when it stops.</w:t>
+        <w:t xml:space="preserve"> — Three possible answers, and what each one does.</w:t>
       </w:r>
     </w:p>
     <w:p>
@@ -479,7 +479,7 @@
           <w:sz w:val="19"/>
           <w:szCs w:val="19"/>
         </w:rPr>
-        <w:t xml:space="preserve">  Taking an action back</w:t>
+        <w:t xml:space="preserve">  Deadlines and reminders</w:t>
       </w:r>
       <w:r>
         <w:rPr>
@@ -487,7 +487,7 @@
           <w:sz w:val="18"/>
           <w:szCs w:val="18"/>
         </w:rPr>
-        <w:t xml:space="preserve"> — Recall your own dispatch; a supervisor can reverse a decision.</w:t>
+        <w:t xml:space="preserve"> — How the clock works, and when it stops.</w:t>
       </w:r>
     </w:p>
     <w:p>
@@ -502,6 +502,35 @@
           <w:szCs w:val="19"/>
         </w:rPr>
         <w:t xml:space="preserve">2.6</w:t>
+      </w:r>
+      <w:r>
+        <w:rPr>
+          <w:sz w:val="19"/>
+          <w:szCs w:val="19"/>
+        </w:rPr>
+        <w:t xml:space="preserve">  Taking an action back</w:t>
+      </w:r>
+      <w:r>
+        <w:rPr>
+          <w:color w:val="94A3B8"/>
+          <w:sz w:val="18"/>
+          <w:szCs w:val="18"/>
+        </w:rPr>
+        <w:t xml:space="preserve"> — Recall your own dispatch; a supervisor can reverse a decision.</w:t>
+      </w:r>
+    </w:p>
+    <w:p>
+      <w:pPr>
+        <w:spacing w:after="20"/>
+        <w:ind w:left="340" w:hanging="340"/>
+      </w:pPr>
+      <w:r>
+        <w:rPr>
+          <w:color w:val="64748B"/>
+          <w:sz w:val="19"/>
+          <w:szCs w:val="19"/>
+        </w:rPr>
+        <w:t xml:space="preserve">2.7</w:t>
       </w:r>
       <w:r>
         <w:rPr>
@@ -3742,7 +3771,7 @@
         <w:t xml:space="preserve">2.3   </w:t>
       </w:r>
       <w:r>
-        <w:t xml:space="preserve">When you are asked to verify</w:t>
+        <w:t xml:space="preserve">Approving a different amount</w:t>
       </w:r>
     </w:p>
     <w:p>
@@ -3757,7 +3786,7 @@
           <w:sz w:val="19"/>
           <w:szCs w:val="19"/>
         </w:rPr>
-        <w:t xml:space="preserve">Three possible answers, and what each one does.</w:t>
+        <w:t xml:space="preserve">You are not limited to the figure you were asked to approve.</w:t>
       </w:r>
     </w:p>
     <w:p>
@@ -3765,65 +3794,7 @@
         <w:spacing w:after="120"/>
       </w:pPr>
       <w:r>
-        <w:t xml:space="preserve">A verification asks you to check something. You have three answers:</w:t>
-      </w:r>
-    </w:p>
-    <w:p>
-      <w:pPr>
-        <w:spacing w:after="60"/>
-        <w:ind w:left="400" w:hanging="280"/>
-      </w:pPr>
-      <w:r>
-        <w:rPr>
-          <w:b/>
-        </w:rPr>
-        <w:t xml:space="preserve">•</w:t>
-      </w:r>
-      <w:r>
-        <w:t xml:space="preserve">  Verified — you checked and it is correct.</w:t>
-      </w:r>
-    </w:p>
-    <w:p>
-      <w:pPr>
-        <w:spacing w:after="60"/>
-        <w:ind w:left="400" w:hanging="280"/>
-      </w:pPr>
-      <w:r>
-        <w:rPr>
-          <w:b/>
-        </w:rPr>
-        <w:t xml:space="preserve">•</w:t>
-      </w:r>
-      <w:r>
-        <w:t xml:space="preserve">  Verified with observation — correct, but with a note the approver should read.</w:t>
-      </w:r>
-    </w:p>
-    <w:p>
-      <w:pPr>
-        <w:spacing w:after="60"/>
-        <w:ind w:left="400" w:hanging="280"/>
-      </w:pPr>
-      <w:r>
-        <w:rPr>
-          <w:b/>
-        </w:rPr>
-        <w:t xml:space="preserve">•</w:t>
-      </w:r>
-      <w:r>
-        <w:t xml:space="preserve">  Not verified — it does not check out.</w:t>
-      </w:r>
-    </w:p>
-    <w:p>
-      <w:pPr>
-        <w:spacing w:after="60"/>
-      </w:pPr>
-    </w:p>
-    <w:p>
-      <w:pPr>
-        <w:spacing w:after="120"/>
-      </w:pPr>
-      <w:r>
-        <w:t xml:space="preserve">All three send the file straight back to whoever asked. "Not verified" does not reject the request; the approver decides what to do about it.</w:t>
+        <w:t xml:space="preserve">On a request that carries an amount, Approve and Approve &amp; Complete show it to you as an editable field, not just a number on the screen. Leave it as it is to approve exactly what was asked for. Change it to approve something else — the same thing as striking out a figure on a paper note-sheet and writing a different one above it.</w:t>
       </w:r>
     </w:p>
     <w:p>
@@ -3846,7 +3817,38 @@
         <w:rPr>
           <w:color w:val="0C4A6E"/>
         </w:rPr>
-        <w:t xml:space="preserve">You can send it on for further verification yourself. However deep that goes, each answer returns to the person who asked for it, one level at a time.</w:t>
+        <w:t xml:space="preserve">If somebody approved before you at a different figure, you see that figure — not the original request — because that is what is actually being carried forward. Change it again and whoever comes after you sees yours.</w:t>
+      </w:r>
+    </w:p>
+    <w:p>
+      <w:pPr>
+        <w:pBdr>
+          <w:left w:val="single" w:sz="18" w:space="8" w:color="F59E0B"/>
+        </w:pBdr>
+        <w:shd w:val="clear" w:color="auto" w:fill="FFFBEB"/>
+        <w:spacing w:before="80" w:after="140"/>
+        <w:ind w:left="170"/>
+      </w:pPr>
+      <w:r>
+        <w:rPr>
+          <w:b/>
+          <w:color w:val="B45309"/>
+        </w:rPr>
+        <w:t xml:space="preserve">Important   </w:t>
+      </w:r>
+      <w:r>
+        <w:rPr>
+          <w:color w:val="7C2D12"/>
+        </w:rPr>
+        <w:t xml:space="preserve">This does not touch the approvals given before you. Revising the amount is part of your own decision, not an edit to the request — nobody has to re-approve anything because of it. That protection exists for a different situation: the requester changing the proposal itself after it has already been approved. See "If a request comes back to you" in Part 1.</w:t>
+      </w:r>
+    </w:p>
+    <w:p>
+      <w:pPr>
+        <w:spacing w:after="120"/>
+      </w:pPr>
+      <w:r>
+        <w:t xml:space="preserve">Wherever the amount is shown afterwards — the Overview tab, the workflow timeline, the Activity trail, the printed Approval Note — you will see both figures when they differ: what was requested, and what was actually sanctioned.</w:t>
       </w:r>
     </w:p>
     <w:p>
@@ -3862,7 +3864,7 @@
         <w:t xml:space="preserve">2.4   </w:t>
       </w:r>
       <w:r>
-        <w:t xml:space="preserve">Deadlines and reminders</w:t>
+        <w:t xml:space="preserve">When you are asked to verify</w:t>
       </w:r>
     </w:p>
     <w:p>
@@ -3877,7 +3879,7 @@
           <w:sz w:val="19"/>
           <w:szCs w:val="19"/>
         </w:rPr>
-        <w:t xml:space="preserve">How the clock works, and when it stops.</w:t>
+        <w:t xml:space="preserve">Three possible answers, and what each one does.</w:t>
       </w:r>
     </w:p>
     <w:p>
@@ -3885,7 +3887,65 @@
         <w:spacing w:after="120"/>
       </w:pPr>
       <w:r>
-        <w:t xml:space="preserve">Each stage carries an SLA in hours, scaled by the priority of the request — an urgent file gets a quarter of the normal time, a low-priority one half again as much.</w:t>
+        <w:t xml:space="preserve">A verification asks you to check something. You have three answers:</w:t>
+      </w:r>
+    </w:p>
+    <w:p>
+      <w:pPr>
+        <w:spacing w:after="60"/>
+        <w:ind w:left="400" w:hanging="280"/>
+      </w:pPr>
+      <w:r>
+        <w:rPr>
+          <w:b/>
+        </w:rPr>
+        <w:t xml:space="preserve">•</w:t>
+      </w:r>
+      <w:r>
+        <w:t xml:space="preserve">  Verified — you checked and it is correct.</w:t>
+      </w:r>
+    </w:p>
+    <w:p>
+      <w:pPr>
+        <w:spacing w:after="60"/>
+        <w:ind w:left="400" w:hanging="280"/>
+      </w:pPr>
+      <w:r>
+        <w:rPr>
+          <w:b/>
+        </w:rPr>
+        <w:t xml:space="preserve">•</w:t>
+      </w:r>
+      <w:r>
+        <w:t xml:space="preserve">  Verified with observation — correct, but with a note the approver should read.</w:t>
+      </w:r>
+    </w:p>
+    <w:p>
+      <w:pPr>
+        <w:spacing w:after="60"/>
+        <w:ind w:left="400" w:hanging="280"/>
+      </w:pPr>
+      <w:r>
+        <w:rPr>
+          <w:b/>
+        </w:rPr>
+        <w:t xml:space="preserve">•</w:t>
+      </w:r>
+      <w:r>
+        <w:t xml:space="preserve">  Not verified — it does not check out.</w:t>
+      </w:r>
+    </w:p>
+    <w:p>
+      <w:pPr>
+        <w:spacing w:after="60"/>
+      </w:pPr>
+    </w:p>
+    <w:p>
+      <w:pPr>
+        <w:spacing w:after="120"/>
+      </w:pPr>
+      <w:r>
+        <w:t xml:space="preserve">All three send the file straight back to whoever asked. "Not verified" does not reject the request; the approver decides what to do about it.</w:t>
       </w:r>
     </w:p>
     <w:p>
@@ -3908,15 +3968,7 @@
         <w:rPr>
           <w:color w:val="0C4A6E"/>
         </w:rPr>
-        <w:t xml:space="preserve">Your clock stops while you are waiting on a verification you asked for, and while the file is on hold. You are only ever answerable for the time you actually held it.</w:t>
-      </w:r>
-    </w:p>
-    <w:p>
-      <w:pPr>
-        <w:spacing w:after="120"/>
-      </w:pPr>
-      <w:r>
-        <w:t xml:space="preserve">Reminders follow a ladder your administrator sets — by default at 24, 48, 72 and 96 hours, escalating through Level 1 to Management. A reminder is never sent twice for the same rule.</w:t>
+        <w:t xml:space="preserve">You can send it on for further verification yourself. However deep that goes, each answer returns to the person who asked for it, one level at a time.</w:t>
       </w:r>
     </w:p>
     <w:p>
@@ -3930,6 +3982,76 @@
           <w:color w:val="64748B"/>
         </w:rPr>
         <w:t xml:space="preserve">2.5   </w:t>
+      </w:r>
+      <w:r>
+        <w:t xml:space="preserve">Deadlines and reminders</w:t>
+      </w:r>
+    </w:p>
+    <w:p>
+      <w:pPr>
+        <w:keepNext/>
+        <w:spacing w:after="140"/>
+      </w:pPr>
+      <w:r>
+        <w:rPr>
+          <w:i/>
+          <w:color w:val="475569"/>
+          <w:sz w:val="19"/>
+          <w:szCs w:val="19"/>
+        </w:rPr>
+        <w:t xml:space="preserve">How the clock works, and when it stops.</w:t>
+      </w:r>
+    </w:p>
+    <w:p>
+      <w:pPr>
+        <w:spacing w:after="120"/>
+      </w:pPr>
+      <w:r>
+        <w:t xml:space="preserve">Each stage carries an SLA in hours, scaled by the priority of the request — an urgent file gets a quarter of the normal time, a low-priority one half again as much.</w:t>
+      </w:r>
+    </w:p>
+    <w:p>
+      <w:pPr>
+        <w:pBdr>
+          <w:left w:val="single" w:sz="18" w:space="8" w:color="38BDF8"/>
+        </w:pBdr>
+        <w:shd w:val="clear" w:color="auto" w:fill="F0F9FF"/>
+        <w:spacing w:before="80" w:after="140"/>
+        <w:ind w:left="170"/>
+      </w:pPr>
+      <w:r>
+        <w:rPr>
+          <w:b/>
+          <w:color w:val="0369A1"/>
+        </w:rPr>
+        <w:t xml:space="preserve">Note   </w:t>
+      </w:r>
+      <w:r>
+        <w:rPr>
+          <w:color w:val="0C4A6E"/>
+        </w:rPr>
+        <w:t xml:space="preserve">Your clock stops while you are waiting on a verification you asked for, and while the file is on hold. You are only ever answerable for the time you actually held it.</w:t>
+      </w:r>
+    </w:p>
+    <w:p>
+      <w:pPr>
+        <w:spacing w:after="120"/>
+      </w:pPr>
+      <w:r>
+        <w:t xml:space="preserve">Reminders follow a ladder your administrator sets — by default at 24, 48, 72 and 96 hours, escalating through Level 1 to Management. A reminder is never sent twice for the same rule.</w:t>
+      </w:r>
+    </w:p>
+    <w:p>
+      <w:pPr>
+        <w:pStyle w:val="Heading2"/>
+        <w:keepNext/>
+        <w:spacing w:before="280" w:after="60"/>
+      </w:pPr>
+      <w:r>
+        <w:rPr>
+          <w:color w:val="64748B"/>
+        </w:rPr>
+        <w:t xml:space="preserve">2.6   </w:t>
       </w:r>
       <w:r>
         <w:t xml:space="preserve">Taking an action back</w:t>
@@ -4267,7 +4389,7 @@
         <w:rPr>
           <w:color w:val="64748B"/>
         </w:rPr>
-        <w:t xml:space="preserve">2.6   </w:t>
+        <w:t xml:space="preserve">2.7   </w:t>
       </w:r>
       <w:r>
         <w:t xml:space="preserve">Going on leave</w:t>

</xml_diff>

<commit_message>
feat: implement E-Approval engine logic, manual documentation, and core UI components
</commit_message>
<xml_diff>
--- a/docs/E-Approval-Manual.docx
+++ b/docs/E-Approval-Manual.docx
@@ -55,7 +55,7 @@
           <w:sz w:val="18"/>
           <w:szCs w:val="18"/>
         </w:rPr>
-        <w:t xml:space="preserve">Version 1.0  ·  2 September 2026</w:t>
+        <w:t xml:space="preserve">Version 1.0  ·  3 September 2026</w:t>
       </w:r>
     </w:p>
     <w:p>
@@ -2952,6 +2952,29 @@
           <w:color w:val="0C4A6E"/>
         </w:rPr>
         <w:t xml:space="preserve">Signing creates a new, signed copy of the document. The original you uploaded is never changed, and stays on the record exactly as it was.</w:t>
+      </w:r>
+    </w:p>
+    <w:p>
+      <w:pPr>
+        <w:pBdr>
+          <w:left w:val="single" w:sz="18" w:space="8" w:color="F59E0B"/>
+        </w:pBdr>
+        <w:shd w:val="clear" w:color="auto" w:fill="FFFBEB"/>
+        <w:spacing w:before="80" w:after="140"/>
+        <w:ind w:left="170"/>
+      </w:pPr>
+      <w:r>
+        <w:rPr>
+          <w:b/>
+          <w:color w:val="B45309"/>
+        </w:rPr>
+        <w:t xml:space="preserve">Important   </w:t>
+      </w:r>
+      <w:r>
+        <w:rPr>
+          <w:color w:val="7C2D12"/>
+        </w:rPr>
+        <w:t xml:space="preserve">Once an approval is closed — approved, rejected or cancelled — nothing on it can be signed any more, by anybody. Sign while the file is still moving. Whatever was signed before it closed stays on the record.</w:t>
       </w:r>
     </w:p>
     <w:p>

</xml_diff>

<commit_message>
feat: implement e-approval module foundation including shared state hooks, business logic services, and documentation.
</commit_message>
<xml_diff>
--- a/docs/E-Approval-Manual.docx
+++ b/docs/E-Approval-Manual.docx
@@ -4484,7 +4484,7 @@
         <w:t xml:space="preserve">3.</w:t>
       </w:r>
       <w:r>
-        <w:t xml:space="preserve">  Pick whose approvals are being delegated, and to whom.</w:t>
+        <w:t xml:space="preserve">  Choose who is covering for you.</w:t>
       </w:r>
     </w:p>
     <w:p>
@@ -4543,6 +4543,37 @@
           <w:color w:val="0C4A6E"/>
         </w:rPr>
         <w:t xml:space="preserve">A delegation is a dated window and expires on its own. Every action the substitute takes is recorded as "on behalf of" you — the authority is delegated, the accountability is not.</w:t>
+      </w:r>
+    </w:p>
+    <w:p>
+      <w:pPr>
+        <w:spacing w:after="120"/>
+      </w:pPr>
+      <w:r>
+        <w:t xml:space="preserve">You are always the one being covered for — you can delegate your own approvals, and only your own. Removing a delegation follows the same rule.</w:t>
+      </w:r>
+    </w:p>
+    <w:p>
+      <w:pPr>
+        <w:pBdr>
+          <w:left w:val="single" w:sz="18" w:space="8" w:color="38BDF8"/>
+        </w:pBdr>
+        <w:shd w:val="clear" w:color="auto" w:fill="F0F9FF"/>
+        <w:spacing w:before="80" w:after="140"/>
+        <w:ind w:left="170"/>
+      </w:pPr>
+      <w:r>
+        <w:rPr>
+          <w:b/>
+          <w:color w:val="0369A1"/>
+        </w:rPr>
+        <w:t xml:space="preserve">Note   </w:t>
+      </w:r>
+      <w:r>
+        <w:rPr>
+          <w:color w:val="0C4A6E"/>
+        </w:rPr>
+        <w:t xml:space="preserve">Administrators holding "Delegations → Manage Others" can additionally arrange or remove cover on anybody’s behalf — for the colleague who went on leave without setting one up. Everyone can see the full list either way, so it is always clear who is covering for whom.</w:t>
       </w:r>
     </w:p>
     <w:p>
@@ -5997,7 +6028,46 @@
                 <w:sz w:val="19"/>
                 <w:szCs w:val="19"/>
               </w:rPr>
-              <w:t xml:space="preserve">Setting up substitute approvers.</w:t>
+              <w:t xml:space="preserve">Setting up substitute approvers for yourself.</w:t>
+            </w:r>
+          </w:p>
+        </w:tc>
+      </w:tr>
+      <w:tr>
+        <w:tc>
+          <w:tcPr>
+            <w:tcW w:w="2891" w:type="dxa"/>
+            <w:vAlign w:val="top"/>
+          </w:tcPr>
+          <w:p>
+            <w:pPr>
+              <w:spacing w:before="40" w:after="40"/>
+            </w:pPr>
+            <w:r>
+              <w:rPr>
+                <w:b/>
+                <w:sz w:val="19"/>
+                <w:szCs w:val="19"/>
+              </w:rPr>
+              <w:t xml:space="preserve">Delegations → Manage Others</w:t>
+            </w:r>
+          </w:p>
+        </w:tc>
+        <w:tc>
+          <w:tcPr>
+            <w:tcW w:w="6747" w:type="dxa"/>
+            <w:vAlign w:val="top"/>
+          </w:tcPr>
+          <w:p>
+            <w:pPr>
+              <w:spacing w:before="40" w:after="40"/>
+            </w:pPr>
+            <w:r>
+              <w:rPr>
+                <w:sz w:val="19"/>
+                <w:szCs w:val="19"/>
+              </w:rPr>
+              <w:t xml:space="preserve">Arranging or removing cover on somebody else’s behalf. Without it a person can only delegate their own approvals.</w:t>
             </w:r>
           </w:p>
         </w:tc>

</xml_diff>

<commit_message>
feat: implement e-approval module with workflow orchestration, action panels, and management tools
</commit_message>
<xml_diff>
--- a/docs/E-Approval-Manual.docx
+++ b/docs/E-Approval-Manual.docx
@@ -55,7 +55,7 @@
           <w:sz w:val="18"/>
           <w:szCs w:val="18"/>
         </w:rPr>
-        <w:t xml:space="preserve">Version 1.0  ·  3 September 2026</w:t>
+        <w:t xml:space="preserve">Version 1.0  ·  9 September 2026</w:t>
       </w:r>
     </w:p>
     <w:p>
@@ -645,7 +645,7 @@
           <w:sz w:val="18"/>
           <w:szCs w:val="18"/>
         </w:rPr>
-        <w:t xml:space="preserve"> — Named chains of stages.</w:t>
+        <w:t xml:space="preserve"> — Chains of stages and sub-workflows, with different approvers per project.</w:t>
       </w:r>
     </w:p>
     <w:p>
@@ -724,7 +724,7 @@
           <w:sz w:val="19"/>
           <w:szCs w:val="19"/>
         </w:rPr>
-        <w:t xml:space="preserve">  Policies</w:t>
+        <w:t xml:space="preserve">  Project routing</w:t>
       </w:r>
       <w:r>
         <w:rPr>
@@ -732,7 +732,7 @@
           <w:sz w:val="18"/>
           <w:szCs w:val="18"/>
         </w:rPr>
-        <w:t xml:space="preserve"> — Change control, approver powers, recall, reminders and numbering.</w:t>
+        <w:t xml:space="preserve"> — Who holds which post on each project — what makes one workflow serve every site.</w:t>
       </w:r>
     </w:p>
     <w:p>
@@ -753,7 +753,7 @@
           <w:sz w:val="19"/>
           <w:szCs w:val="19"/>
         </w:rPr>
-        <w:t xml:space="preserve">  Permissions</w:t>
+        <w:t xml:space="preserve">  Policies</w:t>
       </w:r>
       <w:r>
         <w:rPr>
@@ -761,7 +761,7 @@
           <w:sz w:val="18"/>
           <w:szCs w:val="18"/>
         </w:rPr>
-        <w:t xml:space="preserve"> — What the role tree governs — and what it deliberately does not.</w:t>
+        <w:t xml:space="preserve"> — Change control, approver powers, recall, reminders and numbering.</w:t>
       </w:r>
     </w:p>
     <w:p>
@@ -782,7 +782,7 @@
           <w:sz w:val="19"/>
           <w:szCs w:val="19"/>
         </w:rPr>
-        <w:t xml:space="preserve">  Scheduling the reminder sweep</w:t>
+        <w:t xml:space="preserve">  Permissions</w:t>
       </w:r>
       <w:r>
         <w:rPr>
@@ -790,7 +790,7 @@
           <w:sz w:val="18"/>
           <w:szCs w:val="18"/>
         </w:rPr>
-        <w:t xml:space="preserve"> — Reminders and escalations need a scheduler.</w:t>
+        <w:t xml:space="preserve"> — What the role tree governs — and what it deliberately does not.</w:t>
       </w:r>
     </w:p>
     <w:p>
@@ -811,7 +811,7 @@
           <w:sz w:val="19"/>
           <w:szCs w:val="19"/>
         </w:rPr>
-        <w:t xml:space="preserve">  Reports</w:t>
+        <w:t xml:space="preserve">  Scheduling the reminder sweep</w:t>
       </w:r>
       <w:r>
         <w:rPr>
@@ -819,7 +819,7 @@
           <w:sz w:val="18"/>
           <w:szCs w:val="18"/>
         </w:rPr>
-        <w:t xml:space="preserve"> — Six analytics areas, with a shared filter and Excel export.</w:t>
+        <w:t xml:space="preserve"> — Reminders and escalations need a scheduler.</w:t>
       </w:r>
     </w:p>
     <w:p>
@@ -834,6 +834,35 @@
           <w:szCs w:val="19"/>
         </w:rPr>
         <w:t xml:space="preserve">3.10</w:t>
+      </w:r>
+      <w:r>
+        <w:rPr>
+          <w:sz w:val="19"/>
+          <w:szCs w:val="19"/>
+        </w:rPr>
+        <w:t xml:space="preserve">  Reports</w:t>
+      </w:r>
+      <w:r>
+        <w:rPr>
+          <w:color w:val="94A3B8"/>
+          <w:sz w:val="18"/>
+          <w:szCs w:val="18"/>
+        </w:rPr>
+        <w:t xml:space="preserve"> — Six analytics areas, with a shared filter and Excel export.</w:t>
+      </w:r>
+    </w:p>
+    <w:p>
+      <w:pPr>
+        <w:spacing w:after="20"/>
+        <w:ind w:left="340" w:hanging="340"/>
+      </w:pPr>
+      <w:r>
+        <w:rPr>
+          <w:color w:val="64748B"/>
+          <w:sz w:val="19"/>
+          <w:szCs w:val="19"/>
+        </w:rPr>
+        <w:t xml:space="preserve">3.11</w:t>
       </w:r>
       <w:r>
         <w:rPr>
@@ -1958,7 +1987,7 @@
         <w:t xml:space="preserve">2.</w:t>
       </w:r>
       <w:r>
-        <w:t xml:space="preserve">  The proposal — the full text being approved. Say what is proposed, why, and what it costs. This is the wording an approver signs.</w:t>
+        <w:t xml:space="preserve">  The proposal — the full text being approved. Say what is proposed, why, and what it costs. This is the wording an approver signs. It is a formatted box like an email body: paste a rate table or comparative statement straight from Excel or Word and it keeps its layout.</w:t>
       </w:r>
     </w:p>
     <w:p>
@@ -3779,6 +3808,29 @@
           <w:color w:val="0C4A6E"/>
         </w:rPr>
         <w:t xml:space="preserve">Verification and forwarding are often confused. Verification borrows somebody briefly and returns; forwarding gives the approval away. If you want an opinion, verify. If it is not your decision to make, forward.</w:t>
+      </w:r>
+    </w:p>
+    <w:p>
+      <w:pPr>
+        <w:pBdr>
+          <w:left w:val="single" w:sz="18" w:space="8" w:color="38BDF8"/>
+        </w:pBdr>
+        <w:shd w:val="clear" w:color="auto" w:fill="F0F9FF"/>
+        <w:spacing w:before="80" w:after="140"/>
+        <w:ind w:left="170"/>
+      </w:pPr>
+      <w:r>
+        <w:rPr>
+          <w:b/>
+          <w:color w:val="0369A1"/>
+        </w:rPr>
+        <w:t xml:space="preserve">Note   </w:t>
+      </w:r>
+      <w:r>
+        <w:rPr>
+          <w:color w:val="0C4A6E"/>
+        </w:rPr>
+        <w:t xml:space="preserve">Every action opens a dialog, and clicking outside it will not close it — so a reason or a comment you have typed cannot be lost to a stray click. Use Cancel, or the cross in the corner, when you do want to abandon it.</w:t>
       </w:r>
     </w:p>
     <w:p>
@@ -4693,7 +4745,7 @@
         <w:t xml:space="preserve">3.</w:t>
       </w:r>
       <w:r>
-        <w:t xml:space="preserve">  Workflows — use "Samples" to seed three example chains, then assign real approvers.</w:t>
+        <w:t xml:space="preserve">  Project Routing — name the head and the post holders on every project. Do this before the workflows: a stage addressed to "Project Manager" is only as right as this list.</w:t>
       </w:r>
     </w:p>
     <w:p>
@@ -4708,7 +4760,7 @@
         <w:t xml:space="preserve">4.</w:t>
       </w:r>
       <w:r>
-        <w:t xml:space="preserve">  Approval Matrix — amount bands per type, each pointing at a workflow. Use the tester before trusting it.</w:t>
+        <w:t xml:space="preserve">  Department Routing — for every department that will receive department-addressed steps.</w:t>
       </w:r>
     </w:p>
     <w:p>
@@ -4723,7 +4775,7 @@
         <w:t xml:space="preserve">5.</w:t>
       </w:r>
       <w:r>
-        <w:t xml:space="preserve">  Department Routing — for every department that will receive department-addressed steps.</w:t>
+        <w:t xml:space="preserve">  Workflows — use "Samples" to seed four example chains, then assign real approvers.</w:t>
       </w:r>
     </w:p>
     <w:p>
@@ -4738,7 +4790,7 @@
         <w:t xml:space="preserve">6.</w:t>
       </w:r>
       <w:r>
-        <w:t xml:space="preserve">  Policies — change control, approver powers, recall and reverse windows, reminders, numbering.</w:t>
+        <w:t xml:space="preserve">  Approval Matrix — amount bands per type, each pointing at a workflow. Use the tester before trusting it.</w:t>
       </w:r>
     </w:p>
     <w:p>
@@ -4753,7 +4805,7 @@
         <w:t xml:space="preserve">7.</w:t>
       </w:r>
       <w:r>
-        <w:t xml:space="preserve">  Deploy the Firestore indexes (firebase deploy --only firestore:indexes).</w:t>
+        <w:t xml:space="preserve">  Policies — change control, approver powers, recall and reverse windows, reminders, numbering.</w:t>
       </w:r>
     </w:p>
     <w:p>
@@ -4768,7 +4820,22 @@
         <w:t xml:space="preserve">8.</w:t>
       </w:r>
       <w:r>
-        <w:t xml:space="preserve">  Schedule the reminder sweep (see 3.8).</w:t>
+        <w:t xml:space="preserve">  Deploy the Firestore indexes (firebase deploy --only firestore:indexes).</w:t>
+      </w:r>
+    </w:p>
+    <w:p>
+      <w:pPr>
+        <w:spacing w:after="60"/>
+        <w:ind w:left="400" w:hanging="280"/>
+      </w:pPr>
+      <w:r>
+        <w:rPr>
+          <w:b/>
+        </w:rPr>
+        <w:t xml:space="preserve">9.</w:t>
+      </w:r>
+      <w:r>
+        <w:t xml:space="preserve">  Schedule the reminder sweep (see 3.9).</w:t>
       </w:r>
     </w:p>
     <w:p>
@@ -4948,7 +5015,7 @@
           <w:sz w:val="19"/>
           <w:szCs w:val="19"/>
         </w:rPr>
-        <w:t xml:space="preserve">Named chains of stages.</w:t>
+        <w:t xml:space="preserve">Chains of stages and sub-workflows, with different approvers per project.</w:t>
       </w:r>
       <w:r>
         <w:rPr>
@@ -4965,7 +5032,7 @@
         <w:spacing w:after="120"/>
       </w:pPr>
       <w:r>
-        <w:t xml:space="preserve">A workflow is an ordered list of stages. A stage with more than one approver runs them in parallel, and you choose how it is satisfied: all must approve, any one, or a set number of them.</w:t>
+        <w:t xml:space="preserve">A workflow is an ordered list of nodes. A node is either a stage — one or more approvers, its own SLA, its own powers — or a sub-workflow, which runs another workflow in place.</w:t>
       </w:r>
     </w:p>
     <w:p>
@@ -4973,7 +5040,15 @@
         <w:spacing w:after="120"/>
       </w:pPr>
       <w:r>
-        <w:t xml:space="preserve">Each stage carries its own SLA and its own set of powers — what that approver may do:</w:t>
+        <w:t xml:space="preserve">A stage with more than one approver runs them in parallel, and you choose how it is satisfied: all must approve, any one, or a set number of them.</w:t>
+      </w:r>
+    </w:p>
+    <w:p>
+      <w:pPr>
+        <w:spacing w:after="120"/>
+      </w:pPr>
+      <w:r>
+        <w:t xml:space="preserve">Each stage carries its own set of powers — what that approver may do:</w:t>
       </w:r>
     </w:p>
     <w:p>
@@ -5040,6 +5115,290 @@
       <w:pPr>
         <w:spacing w:after="60"/>
       </w:pPr>
+    </w:p>
+    <w:p>
+      <w:pPr>
+        <w:spacing w:after="120"/>
+      </w:pPr>
+      <w:r>
+        <w:t xml:space="preserve">Three things let one workflow cover cases that would otherwise need a copy each. Reach for them in this order:</w:t>
+      </w:r>
+    </w:p>
+    <w:tbl>
+      <w:tblPr>
+        <w:tblW w:w="9638" w:type="dxa"/>
+        <w:tblBorders>
+          <w:top w:val="single" w:sz="4" w:space="0" w:color="D4D9E2"/>
+          <w:left w:val="single" w:sz="4" w:space="0" w:color="D4D9E2"/>
+          <w:bottom w:val="single" w:sz="4" w:space="0" w:color="D4D9E2"/>
+          <w:right w:val="single" w:sz="4" w:space="0" w:color="D4D9E2"/>
+          <w:insideH w:val="single" w:sz="4" w:space="0" w:color="D4D9E2"/>
+          <w:insideV w:val="single" w:sz="4" w:space="0" w:color="D4D9E2"/>
+        </w:tblBorders>
+        <w:tblCellMar>
+          <w:top w:w="60" w:type="dxa"/>
+          <w:left w:w="90" w:type="dxa"/>
+          <w:bottom w:w="60" w:type="dxa"/>
+          <w:right w:w="90" w:type="dxa"/>
+        </w:tblCellMar>
+      </w:tblPr>
+      <w:tblGrid>
+        <w:gridCol w:w="2313"/>
+        <w:gridCol w:w="3663"/>
+        <w:gridCol w:w="3663"/>
+      </w:tblGrid>
+      <w:tr>
+        <w:trPr>
+          <w:tblHeader/>
+        </w:trPr>
+        <w:tc>
+          <w:tcPr>
+            <w:tcW w:w="2313" w:type="dxa"/>
+            <w:shd w:val="clear" w:color="auto" w:fill="EEF2F7"/>
+            <w:vAlign w:val="top"/>
+          </w:tcPr>
+          <w:p>
+            <w:pPr>
+              <w:spacing w:before="40" w:after="40"/>
+            </w:pPr>
+            <w:r>
+              <w:rPr>
+                <w:b/>
+                <w:color w:val="1F2937"/>
+                <w:sz w:val="18"/>
+                <w:szCs w:val="18"/>
+              </w:rPr>
+              <w:t xml:space="preserve">Use</w:t>
+            </w:r>
+          </w:p>
+        </w:tc>
+        <w:tc>
+          <w:tcPr>
+            <w:tcW w:w="3663" w:type="dxa"/>
+            <w:shd w:val="clear" w:color="auto" w:fill="EEF2F7"/>
+            <w:vAlign w:val="top"/>
+          </w:tcPr>
+          <w:p>
+            <w:pPr>
+              <w:spacing w:before="40" w:after="40"/>
+            </w:pPr>
+            <w:r>
+              <w:rPr>
+                <w:b/>
+                <w:color w:val="1F2937"/>
+                <w:sz w:val="18"/>
+                <w:szCs w:val="18"/>
+              </w:rPr>
+              <w:t xml:space="preserve">When</w:t>
+            </w:r>
+          </w:p>
+        </w:tc>
+        <w:tc>
+          <w:tcPr>
+            <w:tcW w:w="3663" w:type="dxa"/>
+            <w:shd w:val="clear" w:color="auto" w:fill="EEF2F7"/>
+            <w:vAlign w:val="top"/>
+          </w:tcPr>
+          <w:p>
+            <w:pPr>
+              <w:spacing w:before="40" w:after="40"/>
+            </w:pPr>
+            <w:r>
+              <w:rPr>
+                <w:b/>
+                <w:color w:val="1F2937"/>
+                <w:sz w:val="18"/>
+                <w:szCs w:val="18"/>
+              </w:rPr>
+              <w:t xml:space="preserve">Where</w:t>
+            </w:r>
+          </w:p>
+        </w:tc>
+      </w:tr>
+      <w:tr>
+        <w:tc>
+          <w:tcPr>
+            <w:tcW w:w="2313" w:type="dxa"/>
+            <w:vAlign w:val="top"/>
+          </w:tcPr>
+          <w:p>
+            <w:pPr>
+              <w:spacing w:before="40" w:after="40"/>
+            </w:pPr>
+            <w:r>
+              <w:rPr>
+                <w:b/>
+                <w:sz w:val="19"/>
+                <w:szCs w:val="19"/>
+              </w:rPr>
+              <w:t xml:space="preserve">A post instead of a person</w:t>
+            </w:r>
+          </w:p>
+        </w:tc>
+        <w:tc>
+          <w:tcPr>
+            <w:tcW w:w="3663" w:type="dxa"/>
+            <w:vAlign w:val="top"/>
+          </w:tcPr>
+          <w:p>
+            <w:pPr>
+              <w:spacing w:before="40" w:after="40"/>
+            </w:pPr>
+            <w:r>
+              <w:rPr>
+                <w:sz w:val="19"/>
+                <w:szCs w:val="19"/>
+              </w:rPr>
+              <w:t xml:space="preserve">The stage is the same everywhere but the person differs by project — two sites, two project managers.</w:t>
+            </w:r>
+          </w:p>
+        </w:tc>
+        <w:tc>
+          <w:tcPr>
+            <w:tcW w:w="3663" w:type="dxa"/>
+            <w:vAlign w:val="top"/>
+          </w:tcPr>
+          <w:p>
+            <w:pPr>
+              <w:spacing w:before="40" w:after="40"/>
+            </w:pPr>
+            <w:r>
+              <w:rPr>
+                <w:sz w:val="19"/>
+                <w:szCs w:val="19"/>
+              </w:rPr>
+              <w:t xml:space="preserve">Add the approver, choose Project, then "A named post". Set the holders under Project Routing.</w:t>
+            </w:r>
+          </w:p>
+        </w:tc>
+      </w:tr>
+      <w:tr>
+        <w:tc>
+          <w:tcPr>
+            <w:tcW w:w="2313" w:type="dxa"/>
+            <w:vAlign w:val="top"/>
+          </w:tcPr>
+          <w:p>
+            <w:pPr>
+              <w:spacing w:before="40" w:after="40"/>
+            </w:pPr>
+            <w:r>
+              <w:rPr>
+                <w:b/>
+                <w:sz w:val="19"/>
+                <w:szCs w:val="19"/>
+              </w:rPr>
+              <w:t xml:space="preserve">Different people here</w:t>
+            </w:r>
+          </w:p>
+        </w:tc>
+        <w:tc>
+          <w:tcPr>
+            <w:tcW w:w="3663" w:type="dxa"/>
+            <w:vAlign w:val="top"/>
+          </w:tcPr>
+          <w:p>
+            <w:pPr>
+              <w:spacing w:before="40" w:after="40"/>
+            </w:pPr>
+            <w:r>
+              <w:rPr>
+                <w:sz w:val="19"/>
+                <w:szCs w:val="19"/>
+              </w:rPr>
+              <w:t xml:space="preserve">One project or department genuinely routes elsewhere, or skips the stage entirely.</w:t>
+            </w:r>
+          </w:p>
+        </w:tc>
+        <w:tc>
+          <w:tcPr>
+            <w:tcW w:w="3663" w:type="dxa"/>
+            <w:vAlign w:val="top"/>
+          </w:tcPr>
+          <w:p>
+            <w:pPr>
+              <w:spacing w:before="40" w:after="40"/>
+            </w:pPr>
+            <w:r>
+              <w:rPr>
+                <w:sz w:val="19"/>
+                <w:szCs w:val="19"/>
+              </w:rPr>
+              <w:t xml:space="preserve">The panel on each stage. Add a variation, pick the projects it covers, name the approvers.</w:t>
+            </w:r>
+          </w:p>
+        </w:tc>
+      </w:tr>
+      <w:tr>
+        <w:tc>
+          <w:tcPr>
+            <w:tcW w:w="2313" w:type="dxa"/>
+            <w:vAlign w:val="top"/>
+          </w:tcPr>
+          <w:p>
+            <w:pPr>
+              <w:spacing w:before="40" w:after="40"/>
+            </w:pPr>
+            <w:r>
+              <w:rPr>
+                <w:b/>
+                <w:sz w:val="19"/>
+                <w:szCs w:val="19"/>
+              </w:rPr>
+              <w:t xml:space="preserve">When it runs</w:t>
+            </w:r>
+          </w:p>
+        </w:tc>
+        <w:tc>
+          <w:tcPr>
+            <w:tcW w:w="3663" w:type="dxa"/>
+            <w:vAlign w:val="top"/>
+          </w:tcPr>
+          <w:p>
+            <w:pPr>
+              <w:spacing w:before="40" w:after="40"/>
+            </w:pPr>
+            <w:r>
+              <w:rPr>
+                <w:sz w:val="19"/>
+                <w:szCs w:val="19"/>
+              </w:rPr>
+              <w:t xml:space="preserve">The stage only applies above an amount, on certain projects, or for a priority.</w:t>
+            </w:r>
+          </w:p>
+        </w:tc>
+        <w:tc>
+          <w:tcPr>
+            <w:tcW w:w="3663" w:type="dxa"/>
+            <w:vAlign w:val="top"/>
+          </w:tcPr>
+          <w:p>
+            <w:pPr>
+              <w:spacing w:before="40" w:after="40"/>
+            </w:pPr>
+            <w:r>
+              <w:rPr>
+                <w:sz w:val="19"/>
+                <w:szCs w:val="19"/>
+              </w:rPr>
+              <w:t xml:space="preserve">The panel on each stage. Empty means always.</w:t>
+            </w:r>
+          </w:p>
+        </w:tc>
+      </w:tr>
+    </w:tbl>
+    <w:p>
+      <w:pPr>
+        <w:spacing w:after="120"/>
+      </w:pPr>
+    </w:p>
+    <w:p>
+      <w:pPr>
+        <w:spacing w:after="120"/>
+      </w:pPr>
+      <w:r>
+        <w:t xml:space="preserve">A sub-workflow is a run of stages written once and called from several chains — "Finance Clearance", "Safety Sign-off". It lives on its own tab, is never offered as a route on the request form, and is a reference rather than a copy: edit it once and every chain that calls it changes with it.</w:t>
+      </w:r>
     </w:p>
     <w:p>
       <w:pPr>
@@ -5061,7 +5420,30 @@
         <w:rPr>
           <w:color w:val="7C2D12"/>
         </w:rPr>
-        <w:t xml:space="preserve">A stage with no approver assigned is skipped when the chain is built, and the request goes through one signature short. The list flags these in amber.</w:t>
+        <w:t xml:space="preserve">Use the tester inside the editor before trusting a workflow. Pick a project and an amount and it shows the chain that will actually be built — sub-workflows expanded, conditions applied, posts resolved to real names. With sub-workflows and per-project approvers, what a workflow does is no longer visible from what it says.</w:t>
+      </w:r>
+    </w:p>
+    <w:p>
+      <w:pPr>
+        <w:pBdr>
+          <w:left w:val="single" w:sz="18" w:space="8" w:color="F59E0B"/>
+        </w:pBdr>
+        <w:shd w:val="clear" w:color="auto" w:fill="FFFBEB"/>
+        <w:spacing w:before="80" w:after="140"/>
+        <w:ind w:left="170"/>
+      </w:pPr>
+      <w:r>
+        <w:rPr>
+          <w:b/>
+          <w:color w:val="B45309"/>
+        </w:rPr>
+        <w:t xml:space="preserve">Important   </w:t>
+      </w:r>
+      <w:r>
+        <w:rPr>
+          <w:color w:val="7C2D12"/>
+        </w:rPr>
+        <w:t xml:space="preserve">A stage that resolves to nobody is flagged in amber, and a submission against it is refused with the stage named. Nothing is silently skipped — a missing approver is a gap to fix, not a signature to drop.</w:t>
       </w:r>
     </w:p>
     <w:p>
@@ -5084,7 +5466,7 @@
         <w:rPr>
           <w:color w:val="0C4A6E"/>
         </w:rPr>
-        <w:t xml:space="preserve">Duplicate is useful for building a variant of an existing chain without retyping it.</w:t>
+        <w:t xml:space="preserve">Duplicate is useful for building a variant of an existing chain without retyping it — but prefer a stage variation to a duplicate workflow. Two copies of a chain stop matching the first time somebody edits one.</w:t>
       </w:r>
     </w:p>
     <w:p>
@@ -5507,7 +5889,7 @@
         <w:t xml:space="preserve">3.6   </w:t>
       </w:r>
       <w:r>
-        <w:t xml:space="preserve">Policies</w:t>
+        <w:t xml:space="preserve">Project routing</w:t>
       </w:r>
     </w:p>
     <w:p>
@@ -5522,7 +5904,7 @@
           <w:sz w:val="19"/>
           <w:szCs w:val="19"/>
         </w:rPr>
-        <w:t xml:space="preserve">Change control, approver powers, recall, reminders and numbering.</w:t>
+        <w:t xml:space="preserve">Who holds which post on each project — what makes one workflow serve every site.</w:t>
       </w:r>
       <w:r>
         <w:rPr>
@@ -5531,7 +5913,7 @@
           <w:sz w:val="18"/>
           <w:szCs w:val="18"/>
         </w:rPr>
-        <w:t xml:space="preserve">   ·   /e-approval/settings/policies</w:t>
+        <w:t xml:space="preserve">   ·   /e-approval/settings/projects</w:t>
       </w:r>
     </w:p>
     <w:p>
@@ -5539,16 +5921,73 @@
         <w:spacing w:after="120"/>
       </w:pPr>
       <w:r>
-        <w:t xml:space="preserve">Five groups of settings, all held in one record and saved together.</w:t>
-      </w:r>
-    </w:p>
-    <w:p>
-      <w:pPr>
-        <w:spacing w:after="120"/>
-      </w:pPr>
-      <w:r>
-        <w:t xml:space="preserve">Change control — which edits invalidate approvals already given.</w:t>
-      </w:r>
+        <w:t xml:space="preserve">Two sites means two project managers, two site accountants and two store in-charges, all signing the same chain. Rather than a copy of the workflow per site, the workflow names the post and this page says who holds it where.</w:t>
+      </w:r>
+    </w:p>
+    <w:p>
+      <w:pPr>
+        <w:spacing w:after="60"/>
+        <w:ind w:left="400" w:hanging="280"/>
+      </w:pPr>
+      <w:r>
+        <w:rPr>
+          <w:b/>
+        </w:rPr>
+        <w:t xml:space="preserve">1.</w:t>
+      </w:r>
+      <w:r>
+        <w:t xml:space="preserve">  Open a project and set its head — the fallback for any post with no holder.</w:t>
+      </w:r>
+    </w:p>
+    <w:p>
+      <w:pPr>
+        <w:spacing w:after="60"/>
+        <w:ind w:left="400" w:hanging="280"/>
+      </w:pPr>
+      <w:r>
+        <w:rPr>
+          <w:b/>
+        </w:rPr>
+        <w:t xml:space="preserve">2.</w:t>
+      </w:r>
+      <w:r>
+        <w:t xml:space="preserve">  Add the posts that sign approvals here: Project Manager, Site In-Charge, Site Accountant, and so on.</w:t>
+      </w:r>
+    </w:p>
+    <w:p>
+      <w:pPr>
+        <w:spacing w:after="60"/>
+        <w:ind w:left="400" w:hanging="280"/>
+      </w:pPr>
+      <w:r>
+        <w:rPr>
+          <w:b/>
+        </w:rPr>
+        <w:t xml:space="preserve">3.</w:t>
+      </w:r>
+      <w:r>
+        <w:t xml:space="preserve">  Name the person holding each. Suggestions cover the usual ones; you can add your own.</w:t>
+      </w:r>
+    </w:p>
+    <w:p>
+      <w:pPr>
+        <w:spacing w:after="60"/>
+        <w:ind w:left="400" w:hanging="280"/>
+      </w:pPr>
+      <w:r>
+        <w:rPr>
+          <w:b/>
+        </w:rPr>
+        <w:t xml:space="preserve">4.</w:t>
+      </w:r>
+      <w:r>
+        <w:t xml:space="preserve">  In a workflow, add an approver, choose Project, pick "A named post", and type the same name.</w:t>
+      </w:r>
+    </w:p>
+    <w:p>
+      <w:pPr>
+        <w:spacing w:after="60"/>
+      </w:pPr>
     </w:p>
     <w:p>
       <w:pPr>
@@ -5570,86 +6009,7 @@
         <w:rPr>
           <w:color w:val="7C2D12"/>
         </w:rPr>
-        <w:t xml:space="preserve">Leave Amount ticked unless you have a specific reason. With it off, a figure can be raised after approval without superseding anything.</w:t>
-      </w:r>
-    </w:p>
-    <w:p>
-      <w:pPr>
-        <w:spacing w:after="120"/>
-      </w:pPr>
-      <w:r>
-        <w:t xml:space="preserve">Amount tolerance treats a change within that percentage as a correction rather than a new proposal; 0 means any change supersedes. Restart-from decides where the chain resumes afterwards.</w:t>
-      </w:r>
-    </w:p>
-    <w:p>
-      <w:pPr>
-        <w:spacing w:after="120"/>
-      </w:pPr>
-      <w:r>
-        <w:t xml:space="preserve">What approvers may do — organisation-wide ceilings on nesting depth, return-to-any-step and approve-&amp;-complete. A workflow stage can switch any of these off for itself; it can never switch one on that is off here.</w:t>
-      </w:r>
-    </w:p>
-    <w:p>
-      <w:pPr>
-        <w:spacing w:after="120"/>
-      </w:pPr>
-      <w:r>
-        <w:t xml:space="preserve">Recall &amp; reverse — the two windows and their on/off switches. See 2.5.</w:t>
-      </w:r>
-    </w:p>
-    <w:p>
-      <w:pPr>
-        <w:spacing w:after="120"/>
-      </w:pPr>
-      <w:r>
-        <w:t xml:space="preserve">Reminders &amp; escalation — the ladder, measured from when a step became active and excluding time paused. Each rule carries a level from Level 1 to Management. "Run now" processes it on demand.</w:t>
-      </w:r>
-    </w:p>
-    <w:p>
-      <w:pPr>
-        <w:spacing w:after="120"/>
-      </w:pPr>
-      <w:r>
-        <w:t xml:space="preserve">Numbering — prefix, separator, digits, and whether the department code appears. The example updates as you type.</w:t>
-      </w:r>
-    </w:p>
-    <w:p>
-      <w:pPr>
-        <w:pStyle w:val="Heading2"/>
-        <w:keepNext/>
-        <w:spacing w:before="280" w:after="60"/>
-      </w:pPr>
-      <w:r>
-        <w:rPr>
-          <w:color w:val="64748B"/>
-        </w:rPr>
-        <w:t xml:space="preserve">3.7   </w:t>
-      </w:r>
-      <w:r>
-        <w:t xml:space="preserve">Permissions</w:t>
-      </w:r>
-    </w:p>
-    <w:p>
-      <w:pPr>
-        <w:keepNext/>
-        <w:spacing w:after="140"/>
-      </w:pPr>
-      <w:r>
-        <w:rPr>
-          <w:i/>
-          <w:color w:val="475569"/>
-          <w:sz w:val="19"/>
-          <w:szCs w:val="19"/>
-        </w:rPr>
-        <w:t xml:space="preserve">What the role tree governs — and what it deliberately does not.</w:t>
-      </w:r>
-    </w:p>
-    <w:p>
-      <w:pPr>
-        <w:spacing w:after="120"/>
-      </w:pPr>
-      <w:r>
-        <w:t xml:space="preserve">Granted in Settings → Role Management under E-Approval.</w:t>
+        <w:t xml:space="preserve">Post names are matched exactly. "Project manager" is not "Project Manager". Pick from the suggestions in the workflow builder wherever you can — it offers every post name any project has configured.</w:t>
       </w:r>
     </w:p>
     <w:tbl>
@@ -5695,7 +6055,7 @@
                 <w:sz w:val="18"/>
                 <w:szCs w:val="18"/>
               </w:rPr>
-              <w:t xml:space="preserve">Node</w:t>
+              <w:t xml:space="preserve">Mode</w:t>
             </w:r>
           </w:p>
         </w:tc>
@@ -5716,7 +6076,7 @@
                 <w:sz w:val="18"/>
                 <w:szCs w:val="18"/>
               </w:rPr>
-              <w:t xml:space="preserve">Governs</w:t>
+              <w:t xml:space="preserve">Behaviour</w:t>
             </w:r>
           </w:p>
         </w:tc>
@@ -5737,7 +6097,7 @@
                 <w:sz w:val="19"/>
                 <w:szCs w:val="19"/>
               </w:rPr>
-              <w:t xml:space="preserve">View Module, Dashboard, Inbox</w:t>
+              <w:t xml:space="preserve">A named post</w:t>
             </w:r>
           </w:p>
         </w:tc>
@@ -5755,7 +6115,7 @@
                 <w:sz w:val="19"/>
                 <w:szCs w:val="19"/>
               </w:rPr>
-              <w:t xml:space="preserve">Seeing the module at all.</w:t>
+              <w:t xml:space="preserve">Stages name a post; each resolves to whoever holds it on the request’s project.</w:t>
             </w:r>
           </w:p>
         </w:tc>
@@ -5776,7 +6136,7 @@
                 <w:sz w:val="19"/>
                 <w:szCs w:val="19"/>
               </w:rPr>
-              <w:t xml:space="preserve">Requests</w:t>
+              <w:t xml:space="preserve">Project head</w:t>
             </w:r>
           </w:p>
         </w:tc>
@@ -5794,7 +6154,7 @@
                 <w:sz w:val="19"/>
                 <w:szCs w:val="19"/>
               </w:rPr>
-              <w:t xml:space="preserve">Create, edit, delete a draft, cancel, and how much of the register you can see.</w:t>
+              <w:t xml:space="preserve">Goes straight to the project head.</w:t>
             </w:r>
           </w:p>
         </w:tc>
@@ -5815,7 +6175,7 @@
                 <w:sz w:val="19"/>
                 <w:szCs w:val="19"/>
               </w:rPr>
-              <w:t xml:space="preserve">Requests → View Confidential</w:t>
+              <w:t xml:space="preserve">Anyone on the team</w:t>
             </w:r>
           </w:p>
         </w:tc>
@@ -5833,7 +6193,7 @@
                 <w:sz w:val="19"/>
                 <w:szCs w:val="19"/>
               </w:rPr>
-              <w:t xml:space="preserve">Opening files marked confidential.</w:t>
+              <w:t xml:space="preserve">Any listed member can take it. Claiming it locks it to that person.</w:t>
             </w:r>
           </w:p>
         </w:tc>
@@ -5854,7 +6214,7 @@
                 <w:sz w:val="19"/>
                 <w:szCs w:val="19"/>
               </w:rPr>
-              <w:t xml:space="preserve">Comments, Attachments</w:t>
+              <w:t xml:space="preserve">Queue</w:t>
             </w:r>
           </w:p>
         </w:tc>
@@ -5872,241 +6232,7 @@
                 <w:sz w:val="19"/>
                 <w:szCs w:val="19"/>
               </w:rPr>
-              <w:t xml:space="preserve">Commenting and uploading.</w:t>
-            </w:r>
-          </w:p>
-        </w:tc>
-      </w:tr>
-      <w:tr>
-        <w:tc>
-          <w:tcPr>
-            <w:tcW w:w="2891" w:type="dxa"/>
-            <w:vAlign w:val="top"/>
-          </w:tcPr>
-          <w:p>
-            <w:pPr>
-              <w:spacing w:before="40" w:after="40"/>
-            </w:pPr>
-            <w:r>
-              <w:rPr>
-                <w:b/>
-                <w:sz w:val="19"/>
-                <w:szCs w:val="19"/>
-              </w:rPr>
-              <w:t xml:space="preserve">Audit Trail</w:t>
-            </w:r>
-          </w:p>
-        </w:tc>
-        <w:tc>
-          <w:tcPr>
-            <w:tcW w:w="6747" w:type="dxa"/>
-            <w:vAlign w:val="top"/>
-          </w:tcPr>
-          <w:p>
-            <w:pPr>
-              <w:spacing w:before="40" w:after="40"/>
-            </w:pPr>
-            <w:r>
-              <w:rPr>
-                <w:sz w:val="19"/>
-                <w:szCs w:val="19"/>
-              </w:rPr>
-              <w:t xml:space="preserve">The Activity tab.</w:t>
-            </w:r>
-          </w:p>
-        </w:tc>
-      </w:tr>
-      <w:tr>
-        <w:tc>
-          <w:tcPr>
-            <w:tcW w:w="2891" w:type="dxa"/>
-            <w:vAlign w:val="top"/>
-          </w:tcPr>
-          <w:p>
-            <w:pPr>
-              <w:spacing w:before="40" w:after="40"/>
-            </w:pPr>
-            <w:r>
-              <w:rPr>
-                <w:b/>
-                <w:sz w:val="19"/>
-                <w:szCs w:val="19"/>
-              </w:rPr>
-              <w:t xml:space="preserve">Reversals → Reverse Any</w:t>
-            </w:r>
-          </w:p>
-        </w:tc>
-        <w:tc>
-          <w:tcPr>
-            <w:tcW w:w="6747" w:type="dxa"/>
-            <w:vAlign w:val="top"/>
-          </w:tcPr>
-          <w:p>
-            <w:pPr>
-              <w:spacing w:before="40" w:after="40"/>
-            </w:pPr>
-            <w:r>
-              <w:rPr>
-                <w:sz w:val="19"/>
-                <w:szCs w:val="19"/>
-              </w:rPr>
-              <w:t xml:space="preserve">Undoing somebody else’s completed action.</w:t>
-            </w:r>
-          </w:p>
-        </w:tc>
-      </w:tr>
-      <w:tr>
-        <w:tc>
-          <w:tcPr>
-            <w:tcW w:w="2891" w:type="dxa"/>
-            <w:vAlign w:val="top"/>
-          </w:tcPr>
-          <w:p>
-            <w:pPr>
-              <w:spacing w:before="40" w:after="40"/>
-            </w:pPr>
-            <w:r>
-              <w:rPr>
-                <w:b/>
-                <w:sz w:val="19"/>
-                <w:szCs w:val="19"/>
-              </w:rPr>
-              <w:t xml:space="preserve">Reports</w:t>
-            </w:r>
-          </w:p>
-        </w:tc>
-        <w:tc>
-          <w:tcPr>
-            <w:tcW w:w="6747" w:type="dxa"/>
-            <w:vAlign w:val="top"/>
-          </w:tcPr>
-          <w:p>
-            <w:pPr>
-              <w:spacing w:before="40" w:after="40"/>
-            </w:pPr>
-            <w:r>
-              <w:rPr>
-                <w:sz w:val="19"/>
-                <w:szCs w:val="19"/>
-              </w:rPr>
-              <w:t xml:space="preserve">The analytics pages, and exporting them.</w:t>
-            </w:r>
-          </w:p>
-        </w:tc>
-      </w:tr>
-      <w:tr>
-        <w:tc>
-          <w:tcPr>
-            <w:tcW w:w="2891" w:type="dxa"/>
-            <w:vAlign w:val="top"/>
-          </w:tcPr>
-          <w:p>
-            <w:pPr>
-              <w:spacing w:before="40" w:after="40"/>
-            </w:pPr>
-            <w:r>
-              <w:rPr>
-                <w:b/>
-                <w:sz w:val="19"/>
-                <w:szCs w:val="19"/>
-              </w:rPr>
-              <w:t xml:space="preserve">Delegations</w:t>
-            </w:r>
-          </w:p>
-        </w:tc>
-        <w:tc>
-          <w:tcPr>
-            <w:tcW w:w="6747" w:type="dxa"/>
-            <w:vAlign w:val="top"/>
-          </w:tcPr>
-          <w:p>
-            <w:pPr>
-              <w:spacing w:before="40" w:after="40"/>
-            </w:pPr>
-            <w:r>
-              <w:rPr>
-                <w:sz w:val="19"/>
-                <w:szCs w:val="19"/>
-              </w:rPr>
-              <w:t xml:space="preserve">Setting up substitute approvers for yourself.</w:t>
-            </w:r>
-          </w:p>
-        </w:tc>
-      </w:tr>
-      <w:tr>
-        <w:tc>
-          <w:tcPr>
-            <w:tcW w:w="2891" w:type="dxa"/>
-            <w:vAlign w:val="top"/>
-          </w:tcPr>
-          <w:p>
-            <w:pPr>
-              <w:spacing w:before="40" w:after="40"/>
-            </w:pPr>
-            <w:r>
-              <w:rPr>
-                <w:b/>
-                <w:sz w:val="19"/>
-                <w:szCs w:val="19"/>
-              </w:rPr>
-              <w:t xml:space="preserve">Delegations → Manage Others</w:t>
-            </w:r>
-          </w:p>
-        </w:tc>
-        <w:tc>
-          <w:tcPr>
-            <w:tcW w:w="6747" w:type="dxa"/>
-            <w:vAlign w:val="top"/>
-          </w:tcPr>
-          <w:p>
-            <w:pPr>
-              <w:spacing w:before="40" w:after="40"/>
-            </w:pPr>
-            <w:r>
-              <w:rPr>
-                <w:sz w:val="19"/>
-                <w:szCs w:val="19"/>
-              </w:rPr>
-              <w:t xml:space="preserve">Arranging or removing cover on somebody else’s behalf. Without it a person can only delegate their own approvals.</w:t>
-            </w:r>
-          </w:p>
-        </w:tc>
-      </w:tr>
-      <w:tr>
-        <w:tc>
-          <w:tcPr>
-            <w:tcW w:w="2891" w:type="dxa"/>
-            <w:vAlign w:val="top"/>
-          </w:tcPr>
-          <w:p>
-            <w:pPr>
-              <w:spacing w:before="40" w:after="40"/>
-            </w:pPr>
-            <w:r>
-              <w:rPr>
-                <w:b/>
-                <w:sz w:val="19"/>
-                <w:szCs w:val="19"/>
-              </w:rPr>
-              <w:t xml:space="preserve">Settings → …</w:t>
-            </w:r>
-          </w:p>
-        </w:tc>
-        <w:tc>
-          <w:tcPr>
-            <w:tcW w:w="6747" w:type="dxa"/>
-            <w:vAlign w:val="top"/>
-          </w:tcPr>
-          <w:p>
-            <w:pPr>
-              <w:spacing w:before="40" w:after="40"/>
-            </w:pPr>
-            <w:r>
-              <w:rPr>
-                <w:sz w:val="19"/>
-                <w:szCs w:val="19"/>
-              </w:rPr>
-              <w:t xml:space="preserve">Each configuration page separately.</w:t>
+              <w:t xml:space="preserve">Held for the project head, who assigns it. Members cannot claim it themselves.</w:t>
             </w:r>
           </w:p>
         </w:tc>
@@ -6137,7 +6263,30 @@
         <w:rPr>
           <w:color w:val="7C2D12"/>
         </w:rPr>
-        <w:t xml:space="preserve">There is no "Approve", "Verify" or "Return" permission, and this is deliberate. Being assigned a step is the authority to act on it. A verifier a Director picked is authorised by that choice — requiring them to also hold a matching role permission is how a file ends up parked with somebody who cannot move it.</w:t>
+        <w:t xml:space="preserve">A post with no holder falls back to the project head, and the preview says so. With no head either, the stage reaches nobody and the submission is refused — so an unconfigured project is visible before a request is raised, not after it stalls.</w:t>
+      </w:r>
+    </w:p>
+    <w:p>
+      <w:pPr>
+        <w:pBdr>
+          <w:left w:val="single" w:sz="18" w:space="8" w:color="38BDF8"/>
+        </w:pBdr>
+        <w:shd w:val="clear" w:color="auto" w:fill="F0F9FF"/>
+        <w:spacing w:before="80" w:after="140"/>
+        <w:ind w:left="170"/>
+      </w:pPr>
+      <w:r>
+        <w:rPr>
+          <w:b/>
+          <w:color w:val="0369A1"/>
+        </w:rPr>
+        <w:t xml:space="preserve">Note   </w:t>
+      </w:r>
+      <w:r>
+        <w:rPr>
+          <w:color w:val="0C4A6E"/>
+        </w:rPr>
+        <w:t xml:space="preserve">Holding a post counts as being on the project: post holders can act on their own stages whether or not they also appear in the team list.</w:t>
       </w:r>
     </w:p>
     <w:p>
@@ -6150,10 +6299,10 @@
         <w:rPr>
           <w:color w:val="64748B"/>
         </w:rPr>
-        <w:t xml:space="preserve">3.8   </w:t>
-      </w:r>
-      <w:r>
-        <w:t xml:space="preserve">Scheduling the reminder sweep</w:t>
+        <w:t xml:space="preserve">3.7   </w:t>
+      </w:r>
+      <w:r>
+        <w:t xml:space="preserve">Policies</w:t>
       </w:r>
     </w:p>
     <w:p>
@@ -6168,7 +6317,16 @@
           <w:sz w:val="19"/>
           <w:szCs w:val="19"/>
         </w:rPr>
-        <w:t xml:space="preserve">Reminders and escalations need a scheduler.</w:t>
+        <w:t xml:space="preserve">Change control, approver powers, recall, reminders and numbering.</w:t>
+      </w:r>
+      <w:r>
+        <w:rPr>
+          <w:rFonts w:ascii="Consolas" w:hAnsi="Consolas"/>
+          <w:color w:val="94A3B8"/>
+          <w:sz w:val="18"/>
+          <w:szCs w:val="18"/>
+        </w:rPr>
+        <w:t xml:space="preserve">   ·   /e-approval/settings/policies</w:t>
       </w:r>
     </w:p>
     <w:p>
@@ -6176,7 +6334,15 @@
         <w:spacing w:after="120"/>
       </w:pPr>
       <w:r>
-        <w:t xml:space="preserve">The endpoint /api/e-approval/escalations processes the ladder. It is safe to call as often as you like — each step records which rules have already fired, so nothing is sent twice.</w:t>
+        <w:t xml:space="preserve">Five groups of settings, all held in one record and saved together.</w:t>
+      </w:r>
+    </w:p>
+    <w:p>
+      <w:pPr>
+        <w:spacing w:after="120"/>
+      </w:pPr>
+      <w:r>
+        <w:t xml:space="preserve">Change control — which edits invalidate approvals already given.</w:t>
       </w:r>
     </w:p>
     <w:p>
@@ -6199,30 +6365,47 @@
         <w:rPr>
           <w:color w:val="7C2D12"/>
         </w:rPr>
-        <w:t xml:space="preserve">Until this is scheduled, no reminder or escalation is ever sent. The "Run now" button on the Policies page is a manual substitute, not a replacement.</w:t>
-      </w:r>
-    </w:p>
-    <w:p>
-      <w:pPr>
-        <w:pBdr>
-          <w:left w:val="single" w:sz="18" w:space="8" w:color="38BDF8"/>
-        </w:pBdr>
-        <w:shd w:val="clear" w:color="auto" w:fill="F0F9FF"/>
-        <w:spacing w:before="80" w:after="140"/>
-        <w:ind w:left="170"/>
-      </w:pPr>
-      <w:r>
-        <w:rPr>
-          <w:b/>
-          <w:color w:val="0369A1"/>
-        </w:rPr>
-        <w:t xml:space="preserve">Note   </w:t>
-      </w:r>
-      <w:r>
-        <w:rPr>
-          <w:color w:val="0C4A6E"/>
-        </w:rPr>
-        <w:t xml:space="preserve">Guard the endpoint with the CRON_SECRET environment variable if it is reachable publicly.</w:t>
+        <w:t xml:space="preserve">Leave Amount ticked unless you have a specific reason. With it off, a figure can be raised after approval without superseding anything.</w:t>
+      </w:r>
+    </w:p>
+    <w:p>
+      <w:pPr>
+        <w:spacing w:after="120"/>
+      </w:pPr>
+      <w:r>
+        <w:t xml:space="preserve">Amount tolerance treats a change within that percentage as a correction rather than a new proposal; 0 means any change supersedes. Restart-from decides where the chain resumes afterwards.</w:t>
+      </w:r>
+    </w:p>
+    <w:p>
+      <w:pPr>
+        <w:spacing w:after="120"/>
+      </w:pPr>
+      <w:r>
+        <w:t xml:space="preserve">What approvers may do — organisation-wide ceilings on nesting depth, return-to-any-step and approve-&amp;-complete. A workflow stage can switch any of these off for itself; it can never switch one on that is off here.</w:t>
+      </w:r>
+    </w:p>
+    <w:p>
+      <w:pPr>
+        <w:spacing w:after="120"/>
+      </w:pPr>
+      <w:r>
+        <w:t xml:space="preserve">Recall &amp; reverse — the two windows and their on/off switches. See 2.5.</w:t>
+      </w:r>
+    </w:p>
+    <w:p>
+      <w:pPr>
+        <w:spacing w:after="120"/>
+      </w:pPr>
+      <w:r>
+        <w:t xml:space="preserve">Reminders &amp; escalation — the ladder, measured from when a step became active and excluding time paused. Each rule carries a level from Level 1 to Management. "Run now" processes it on demand.</w:t>
+      </w:r>
+    </w:p>
+    <w:p>
+      <w:pPr>
+        <w:spacing w:after="120"/>
+      </w:pPr>
+      <w:r>
+        <w:t xml:space="preserve">Numbering — prefix, separator, digits, and whether the department code appears. The example updates as you type.</w:t>
       </w:r>
     </w:p>
     <w:p>
@@ -6235,10 +6418,10 @@
         <w:rPr>
           <w:color w:val="64748B"/>
         </w:rPr>
-        <w:t xml:space="preserve">3.9   </w:t>
-      </w:r>
-      <w:r>
-        <w:t xml:space="preserve">Reports</w:t>
+        <w:t xml:space="preserve">3.8   </w:t>
+      </w:r>
+      <w:r>
+        <w:t xml:space="preserve">Permissions</w:t>
       </w:r>
     </w:p>
     <w:p>
@@ -6253,16 +6436,15 @@
           <w:sz w:val="19"/>
           <w:szCs w:val="19"/>
         </w:rPr>
-        <w:t xml:space="preserve">Six analytics areas, with a shared filter and Excel export.</w:t>
-      </w:r>
-      <w:r>
-        <w:rPr>
-          <w:rFonts w:ascii="Consolas" w:hAnsi="Consolas"/>
-          <w:color w:val="94A3B8"/>
-          <w:sz w:val="18"/>
-          <w:szCs w:val="18"/>
-        </w:rPr>
-        <w:t xml:space="preserve">   ·   /e-approval/reports</w:t>
+        <w:t xml:space="preserve">What the role tree governs — and what it deliberately does not.</w:t>
+      </w:r>
+    </w:p>
+    <w:p>
+      <w:pPr>
+        <w:spacing w:after="120"/>
+      </w:pPr>
+      <w:r>
+        <w:t xml:space="preserve">Granted in Settings → Role Management under E-Approval.</w:t>
       </w:r>
     </w:p>
     <w:tbl>
@@ -6308,7 +6490,7 @@
                 <w:sz w:val="18"/>
                 <w:szCs w:val="18"/>
               </w:rPr>
-              <w:t xml:space="preserve">Report</w:t>
+              <w:t xml:space="preserve">Node</w:t>
             </w:r>
           </w:p>
         </w:tc>
@@ -6329,7 +6511,7 @@
                 <w:sz w:val="18"/>
                 <w:szCs w:val="18"/>
               </w:rPr>
-              <w:t xml:space="preserve">Answers</w:t>
+              <w:t xml:space="preserve">Governs</w:t>
             </w:r>
           </w:p>
         </w:tc>
@@ -6350,7 +6532,7 @@
                 <w:sz w:val="19"/>
                 <w:szCs w:val="19"/>
               </w:rPr>
-              <w:t xml:space="preserve">Executive Command Center</w:t>
+              <w:t xml:space="preserve">View Module, Dashboard, Inbox</w:t>
             </w:r>
           </w:p>
         </w:tc>
@@ -6368,7 +6550,7 @@
                 <w:sz w:val="19"/>
                 <w:szCs w:val="19"/>
               </w:rPr>
-              <w:t xml:space="preserve">What is outstanding, what it is worth, how it has moved period on period.</w:t>
+              <w:t xml:space="preserve">Seeing the module at all.</w:t>
             </w:r>
           </w:p>
         </w:tc>
@@ -6389,7 +6571,7 @@
                 <w:sz w:val="19"/>
                 <w:szCs w:val="19"/>
               </w:rPr>
-              <w:t xml:space="preserve">Status Distribution</w:t>
+              <w:t xml:space="preserve">Requests</w:t>
             </w:r>
           </w:p>
         </w:tc>
@@ -6407,7 +6589,7 @@
                 <w:sz w:val="19"/>
                 <w:szCs w:val="19"/>
               </w:rPr>
-              <w:t xml:space="preserve">Every status, its share and its value, with drill-down.</w:t>
+              <w:t xml:space="preserve">Create, edit, delete a draft, cancel, and how much of the register you can see.</w:t>
             </w:r>
           </w:p>
         </w:tc>
@@ -6428,7 +6610,7 @@
                 <w:sz w:val="19"/>
                 <w:szCs w:val="19"/>
               </w:rPr>
-              <w:t xml:space="preserve">Approval Aging</w:t>
+              <w:t xml:space="preserve">Requests → View Confidential</w:t>
             </w:r>
           </w:p>
         </w:tc>
@@ -6446,7 +6628,7 @@
                 <w:sz w:val="19"/>
                 <w:szCs w:val="19"/>
               </w:rPr>
-              <w:t xml:space="preserve">Nine age bands, and the oldest-pending table with escalation level.</w:t>
+              <w:t xml:space="preserve">Opening files marked confidential.</w:t>
             </w:r>
           </w:p>
         </w:tc>
@@ -6467,7 +6649,7 @@
                 <w:sz w:val="19"/>
                 <w:szCs w:val="19"/>
               </w:rPr>
-              <w:t xml:space="preserve">Bottleneck Intelligence</w:t>
+              <w:t xml:space="preserve">Comments, Attachments</w:t>
             </w:r>
           </w:p>
         </w:tc>
@@ -6485,7 +6667,7 @@
                 <w:sz w:val="19"/>
                 <w:szCs w:val="19"/>
               </w:rPr>
-              <w:t xml:space="preserve">Which desk, department and workflow stage is costing time.</w:t>
+              <w:t xml:space="preserve">Commenting and uploading.</w:t>
             </w:r>
           </w:p>
         </w:tc>
@@ -6506,7 +6688,7 @@
                 <w:sz w:val="19"/>
                 <w:szCs w:val="19"/>
               </w:rPr>
-              <w:t xml:space="preserve">SLA &amp; Escalation</w:t>
+              <w:t xml:space="preserve">Audit Trail</w:t>
             </w:r>
           </w:p>
         </w:tc>
@@ -6524,7 +6706,7 @@
                 <w:sz w:val="19"/>
                 <w:szCs w:val="19"/>
               </w:rPr>
-              <w:t xml:space="preserve">Compliance by department, approver, type or stage; escalation by level.</w:t>
+              <w:t xml:space="preserve">The Activity tab.</w:t>
             </w:r>
           </w:p>
         </w:tc>
@@ -6545,7 +6727,7 @@
                 <w:sz w:val="19"/>
                 <w:szCs w:val="19"/>
               </w:rPr>
-              <w:t xml:space="preserve">Approver Performance</w:t>
+              <w:t xml:space="preserve">Reversals → Reverse Any</w:t>
             </w:r>
           </w:p>
         </w:tc>
@@ -6563,7 +6745,163 @@
                 <w:sz w:val="19"/>
                 <w:szCs w:val="19"/>
               </w:rPr>
-              <w:t xml:space="preserve">Per-person workflow metrics and rankings.</w:t>
+              <w:t xml:space="preserve">Undoing somebody else’s completed action.</w:t>
+            </w:r>
+          </w:p>
+        </w:tc>
+      </w:tr>
+      <w:tr>
+        <w:tc>
+          <w:tcPr>
+            <w:tcW w:w="2891" w:type="dxa"/>
+            <w:vAlign w:val="top"/>
+          </w:tcPr>
+          <w:p>
+            <w:pPr>
+              <w:spacing w:before="40" w:after="40"/>
+            </w:pPr>
+            <w:r>
+              <w:rPr>
+                <w:b/>
+                <w:sz w:val="19"/>
+                <w:szCs w:val="19"/>
+              </w:rPr>
+              <w:t xml:space="preserve">Reports</w:t>
+            </w:r>
+          </w:p>
+        </w:tc>
+        <w:tc>
+          <w:tcPr>
+            <w:tcW w:w="6747" w:type="dxa"/>
+            <w:vAlign w:val="top"/>
+          </w:tcPr>
+          <w:p>
+            <w:pPr>
+              <w:spacing w:before="40" w:after="40"/>
+            </w:pPr>
+            <w:r>
+              <w:rPr>
+                <w:sz w:val="19"/>
+                <w:szCs w:val="19"/>
+              </w:rPr>
+              <w:t xml:space="preserve">The analytics pages, and exporting them.</w:t>
+            </w:r>
+          </w:p>
+        </w:tc>
+      </w:tr>
+      <w:tr>
+        <w:tc>
+          <w:tcPr>
+            <w:tcW w:w="2891" w:type="dxa"/>
+            <w:vAlign w:val="top"/>
+          </w:tcPr>
+          <w:p>
+            <w:pPr>
+              <w:spacing w:before="40" w:after="40"/>
+            </w:pPr>
+            <w:r>
+              <w:rPr>
+                <w:b/>
+                <w:sz w:val="19"/>
+                <w:szCs w:val="19"/>
+              </w:rPr>
+              <w:t xml:space="preserve">Delegations</w:t>
+            </w:r>
+          </w:p>
+        </w:tc>
+        <w:tc>
+          <w:tcPr>
+            <w:tcW w:w="6747" w:type="dxa"/>
+            <w:vAlign w:val="top"/>
+          </w:tcPr>
+          <w:p>
+            <w:pPr>
+              <w:spacing w:before="40" w:after="40"/>
+            </w:pPr>
+            <w:r>
+              <w:rPr>
+                <w:sz w:val="19"/>
+                <w:szCs w:val="19"/>
+              </w:rPr>
+              <w:t xml:space="preserve">Setting up substitute approvers for yourself.</w:t>
+            </w:r>
+          </w:p>
+        </w:tc>
+      </w:tr>
+      <w:tr>
+        <w:tc>
+          <w:tcPr>
+            <w:tcW w:w="2891" w:type="dxa"/>
+            <w:vAlign w:val="top"/>
+          </w:tcPr>
+          <w:p>
+            <w:pPr>
+              <w:spacing w:before="40" w:after="40"/>
+            </w:pPr>
+            <w:r>
+              <w:rPr>
+                <w:b/>
+                <w:sz w:val="19"/>
+                <w:szCs w:val="19"/>
+              </w:rPr>
+              <w:t xml:space="preserve">Delegations → Manage Others</w:t>
+            </w:r>
+          </w:p>
+        </w:tc>
+        <w:tc>
+          <w:tcPr>
+            <w:tcW w:w="6747" w:type="dxa"/>
+            <w:vAlign w:val="top"/>
+          </w:tcPr>
+          <w:p>
+            <w:pPr>
+              <w:spacing w:before="40" w:after="40"/>
+            </w:pPr>
+            <w:r>
+              <w:rPr>
+                <w:sz w:val="19"/>
+                <w:szCs w:val="19"/>
+              </w:rPr>
+              <w:t xml:space="preserve">Arranging or removing cover on somebody else’s behalf. Without it a person can only delegate their own approvals.</w:t>
+            </w:r>
+          </w:p>
+        </w:tc>
+      </w:tr>
+      <w:tr>
+        <w:tc>
+          <w:tcPr>
+            <w:tcW w:w="2891" w:type="dxa"/>
+            <w:vAlign w:val="top"/>
+          </w:tcPr>
+          <w:p>
+            <w:pPr>
+              <w:spacing w:before="40" w:after="40"/>
+            </w:pPr>
+            <w:r>
+              <w:rPr>
+                <w:b/>
+                <w:sz w:val="19"/>
+                <w:szCs w:val="19"/>
+              </w:rPr>
+              <w:t xml:space="preserve">Settings → …</w:t>
+            </w:r>
+          </w:p>
+        </w:tc>
+        <w:tc>
+          <w:tcPr>
+            <w:tcW w:w="6747" w:type="dxa"/>
+            <w:vAlign w:val="top"/>
+          </w:tcPr>
+          <w:p>
+            <w:pPr>
+              <w:spacing w:before="40" w:after="40"/>
+            </w:pPr>
+            <w:r>
+              <w:rPr>
+                <w:sz w:val="19"/>
+                <w:szCs w:val="19"/>
+              </w:rPr>
+              <w:t xml:space="preserve">Each configuration page separately.</w:t>
             </w:r>
           </w:p>
         </w:tc>
@@ -6573,6 +6911,91 @@
       <w:pPr>
         <w:spacing w:after="120"/>
       </w:pPr>
+    </w:p>
+    <w:p>
+      <w:pPr>
+        <w:pBdr>
+          <w:left w:val="single" w:sz="18" w:space="8" w:color="F59E0B"/>
+        </w:pBdr>
+        <w:shd w:val="clear" w:color="auto" w:fill="FFFBEB"/>
+        <w:spacing w:before="80" w:after="140"/>
+        <w:ind w:left="170"/>
+      </w:pPr>
+      <w:r>
+        <w:rPr>
+          <w:b/>
+          <w:color w:val="B45309"/>
+        </w:rPr>
+        <w:t xml:space="preserve">Important   </w:t>
+      </w:r>
+      <w:r>
+        <w:rPr>
+          <w:color w:val="7C2D12"/>
+        </w:rPr>
+        <w:t xml:space="preserve">There is no "Approve", "Verify" or "Return" permission, and this is deliberate. Being assigned a step is the authority to act on it. A verifier a Director picked is authorised by that choice — requiring them to also hold a matching role permission is how a file ends up parked with somebody who cannot move it.</w:t>
+      </w:r>
+    </w:p>
+    <w:p>
+      <w:pPr>
+        <w:pStyle w:val="Heading2"/>
+        <w:keepNext/>
+        <w:spacing w:before="280" w:after="60"/>
+      </w:pPr>
+      <w:r>
+        <w:rPr>
+          <w:color w:val="64748B"/>
+        </w:rPr>
+        <w:t xml:space="preserve">3.9   </w:t>
+      </w:r>
+      <w:r>
+        <w:t xml:space="preserve">Scheduling the reminder sweep</w:t>
+      </w:r>
+    </w:p>
+    <w:p>
+      <w:pPr>
+        <w:keepNext/>
+        <w:spacing w:after="140"/>
+      </w:pPr>
+      <w:r>
+        <w:rPr>
+          <w:i/>
+          <w:color w:val="475569"/>
+          <w:sz w:val="19"/>
+          <w:szCs w:val="19"/>
+        </w:rPr>
+        <w:t xml:space="preserve">Reminders and escalations need a scheduler.</w:t>
+      </w:r>
+    </w:p>
+    <w:p>
+      <w:pPr>
+        <w:spacing w:after="120"/>
+      </w:pPr>
+      <w:r>
+        <w:t xml:space="preserve">The endpoint /api/e-approval/escalations processes the ladder. It is safe to call as often as you like — each step records which rules have already fired, so nothing is sent twice.</w:t>
+      </w:r>
+    </w:p>
+    <w:p>
+      <w:pPr>
+        <w:pBdr>
+          <w:left w:val="single" w:sz="18" w:space="8" w:color="F59E0B"/>
+        </w:pBdr>
+        <w:shd w:val="clear" w:color="auto" w:fill="FFFBEB"/>
+        <w:spacing w:before="80" w:after="140"/>
+        <w:ind w:left="170"/>
+      </w:pPr>
+      <w:r>
+        <w:rPr>
+          <w:b/>
+          <w:color w:val="B45309"/>
+        </w:rPr>
+        <w:t xml:space="preserve">Important   </w:t>
+      </w:r>
+      <w:r>
+        <w:rPr>
+          <w:color w:val="7C2D12"/>
+        </w:rPr>
+        <w:t xml:space="preserve">Until this is scheduled, no reminder or escalation is ever sent. The "Run now" button on the Policies page is a manual substitute, not a replacement.</w:t>
+      </w:r>
     </w:p>
     <w:p>
       <w:pPr>
@@ -6594,6 +7017,378 @@
         <w:rPr>
           <w:color w:val="0C4A6E"/>
         </w:rPr>
+        <w:t xml:space="preserve">Guard the endpoint with the CRON_SECRET environment variable if it is reachable publicly.</w:t>
+      </w:r>
+    </w:p>
+    <w:p>
+      <w:pPr>
+        <w:pStyle w:val="Heading2"/>
+        <w:keepNext/>
+        <w:spacing w:before="280" w:after="60"/>
+      </w:pPr>
+      <w:r>
+        <w:rPr>
+          <w:color w:val="64748B"/>
+        </w:rPr>
+        <w:t xml:space="preserve">3.10   </w:t>
+      </w:r>
+      <w:r>
+        <w:t xml:space="preserve">Reports</w:t>
+      </w:r>
+    </w:p>
+    <w:p>
+      <w:pPr>
+        <w:keepNext/>
+        <w:spacing w:after="140"/>
+      </w:pPr>
+      <w:r>
+        <w:rPr>
+          <w:i/>
+          <w:color w:val="475569"/>
+          <w:sz w:val="19"/>
+          <w:szCs w:val="19"/>
+        </w:rPr>
+        <w:t xml:space="preserve">Six analytics areas, with a shared filter and Excel export.</w:t>
+      </w:r>
+      <w:r>
+        <w:rPr>
+          <w:rFonts w:ascii="Consolas" w:hAnsi="Consolas"/>
+          <w:color w:val="94A3B8"/>
+          <w:sz w:val="18"/>
+          <w:szCs w:val="18"/>
+        </w:rPr>
+        <w:t xml:space="preserve">   ·   /e-approval/reports</w:t>
+      </w:r>
+    </w:p>
+    <w:tbl>
+      <w:tblPr>
+        <w:tblW w:w="9638" w:type="dxa"/>
+        <w:tblBorders>
+          <w:top w:val="single" w:sz="4" w:space="0" w:color="D4D9E2"/>
+          <w:left w:val="single" w:sz="4" w:space="0" w:color="D4D9E2"/>
+          <w:bottom w:val="single" w:sz="4" w:space="0" w:color="D4D9E2"/>
+          <w:right w:val="single" w:sz="4" w:space="0" w:color="D4D9E2"/>
+          <w:insideH w:val="single" w:sz="4" w:space="0" w:color="D4D9E2"/>
+          <w:insideV w:val="single" w:sz="4" w:space="0" w:color="D4D9E2"/>
+        </w:tblBorders>
+        <w:tblCellMar>
+          <w:top w:w="60" w:type="dxa"/>
+          <w:left w:w="90" w:type="dxa"/>
+          <w:bottom w:w="60" w:type="dxa"/>
+          <w:right w:w="90" w:type="dxa"/>
+        </w:tblCellMar>
+      </w:tblPr>
+      <w:tblGrid>
+        <w:gridCol w:w="2891"/>
+        <w:gridCol w:w="6747"/>
+      </w:tblGrid>
+      <w:tr>
+        <w:trPr>
+          <w:tblHeader/>
+        </w:trPr>
+        <w:tc>
+          <w:tcPr>
+            <w:tcW w:w="2891" w:type="dxa"/>
+            <w:shd w:val="clear" w:color="auto" w:fill="EEF2F7"/>
+            <w:vAlign w:val="top"/>
+          </w:tcPr>
+          <w:p>
+            <w:pPr>
+              <w:spacing w:before="40" w:after="40"/>
+            </w:pPr>
+            <w:r>
+              <w:rPr>
+                <w:b/>
+                <w:color w:val="1F2937"/>
+                <w:sz w:val="18"/>
+                <w:szCs w:val="18"/>
+              </w:rPr>
+              <w:t xml:space="preserve">Report</w:t>
+            </w:r>
+          </w:p>
+        </w:tc>
+        <w:tc>
+          <w:tcPr>
+            <w:tcW w:w="6747" w:type="dxa"/>
+            <w:shd w:val="clear" w:color="auto" w:fill="EEF2F7"/>
+            <w:vAlign w:val="top"/>
+          </w:tcPr>
+          <w:p>
+            <w:pPr>
+              <w:spacing w:before="40" w:after="40"/>
+            </w:pPr>
+            <w:r>
+              <w:rPr>
+                <w:b/>
+                <w:color w:val="1F2937"/>
+                <w:sz w:val="18"/>
+                <w:szCs w:val="18"/>
+              </w:rPr>
+              <w:t xml:space="preserve">Answers</w:t>
+            </w:r>
+          </w:p>
+        </w:tc>
+      </w:tr>
+      <w:tr>
+        <w:tc>
+          <w:tcPr>
+            <w:tcW w:w="2891" w:type="dxa"/>
+            <w:vAlign w:val="top"/>
+          </w:tcPr>
+          <w:p>
+            <w:pPr>
+              <w:spacing w:before="40" w:after="40"/>
+            </w:pPr>
+            <w:r>
+              <w:rPr>
+                <w:b/>
+                <w:sz w:val="19"/>
+                <w:szCs w:val="19"/>
+              </w:rPr>
+              <w:t xml:space="preserve">Executive Command Center</w:t>
+            </w:r>
+          </w:p>
+        </w:tc>
+        <w:tc>
+          <w:tcPr>
+            <w:tcW w:w="6747" w:type="dxa"/>
+            <w:vAlign w:val="top"/>
+          </w:tcPr>
+          <w:p>
+            <w:pPr>
+              <w:spacing w:before="40" w:after="40"/>
+            </w:pPr>
+            <w:r>
+              <w:rPr>
+                <w:sz w:val="19"/>
+                <w:szCs w:val="19"/>
+              </w:rPr>
+              <w:t xml:space="preserve">What is outstanding, what it is worth, how it has moved period on period.</w:t>
+            </w:r>
+          </w:p>
+        </w:tc>
+      </w:tr>
+      <w:tr>
+        <w:tc>
+          <w:tcPr>
+            <w:tcW w:w="2891" w:type="dxa"/>
+            <w:vAlign w:val="top"/>
+          </w:tcPr>
+          <w:p>
+            <w:pPr>
+              <w:spacing w:before="40" w:after="40"/>
+            </w:pPr>
+            <w:r>
+              <w:rPr>
+                <w:b/>
+                <w:sz w:val="19"/>
+                <w:szCs w:val="19"/>
+              </w:rPr>
+              <w:t xml:space="preserve">Status Distribution</w:t>
+            </w:r>
+          </w:p>
+        </w:tc>
+        <w:tc>
+          <w:tcPr>
+            <w:tcW w:w="6747" w:type="dxa"/>
+            <w:vAlign w:val="top"/>
+          </w:tcPr>
+          <w:p>
+            <w:pPr>
+              <w:spacing w:before="40" w:after="40"/>
+            </w:pPr>
+            <w:r>
+              <w:rPr>
+                <w:sz w:val="19"/>
+                <w:szCs w:val="19"/>
+              </w:rPr>
+              <w:t xml:space="preserve">Every status, its share and its value, with drill-down.</w:t>
+            </w:r>
+          </w:p>
+        </w:tc>
+      </w:tr>
+      <w:tr>
+        <w:tc>
+          <w:tcPr>
+            <w:tcW w:w="2891" w:type="dxa"/>
+            <w:vAlign w:val="top"/>
+          </w:tcPr>
+          <w:p>
+            <w:pPr>
+              <w:spacing w:before="40" w:after="40"/>
+            </w:pPr>
+            <w:r>
+              <w:rPr>
+                <w:b/>
+                <w:sz w:val="19"/>
+                <w:szCs w:val="19"/>
+              </w:rPr>
+              <w:t xml:space="preserve">Approval Aging</w:t>
+            </w:r>
+          </w:p>
+        </w:tc>
+        <w:tc>
+          <w:tcPr>
+            <w:tcW w:w="6747" w:type="dxa"/>
+            <w:vAlign w:val="top"/>
+          </w:tcPr>
+          <w:p>
+            <w:pPr>
+              <w:spacing w:before="40" w:after="40"/>
+            </w:pPr>
+            <w:r>
+              <w:rPr>
+                <w:sz w:val="19"/>
+                <w:szCs w:val="19"/>
+              </w:rPr>
+              <w:t xml:space="preserve">Nine age bands, and the oldest-pending table with escalation level.</w:t>
+            </w:r>
+          </w:p>
+        </w:tc>
+      </w:tr>
+      <w:tr>
+        <w:tc>
+          <w:tcPr>
+            <w:tcW w:w="2891" w:type="dxa"/>
+            <w:vAlign w:val="top"/>
+          </w:tcPr>
+          <w:p>
+            <w:pPr>
+              <w:spacing w:before="40" w:after="40"/>
+            </w:pPr>
+            <w:r>
+              <w:rPr>
+                <w:b/>
+                <w:sz w:val="19"/>
+                <w:szCs w:val="19"/>
+              </w:rPr>
+              <w:t xml:space="preserve">Bottleneck Intelligence</w:t>
+            </w:r>
+          </w:p>
+        </w:tc>
+        <w:tc>
+          <w:tcPr>
+            <w:tcW w:w="6747" w:type="dxa"/>
+            <w:vAlign w:val="top"/>
+          </w:tcPr>
+          <w:p>
+            <w:pPr>
+              <w:spacing w:before="40" w:after="40"/>
+            </w:pPr>
+            <w:r>
+              <w:rPr>
+                <w:sz w:val="19"/>
+                <w:szCs w:val="19"/>
+              </w:rPr>
+              <w:t xml:space="preserve">Which desk, department and workflow stage is costing time.</w:t>
+            </w:r>
+          </w:p>
+        </w:tc>
+      </w:tr>
+      <w:tr>
+        <w:tc>
+          <w:tcPr>
+            <w:tcW w:w="2891" w:type="dxa"/>
+            <w:vAlign w:val="top"/>
+          </w:tcPr>
+          <w:p>
+            <w:pPr>
+              <w:spacing w:before="40" w:after="40"/>
+            </w:pPr>
+            <w:r>
+              <w:rPr>
+                <w:b/>
+                <w:sz w:val="19"/>
+                <w:szCs w:val="19"/>
+              </w:rPr>
+              <w:t xml:space="preserve">SLA &amp; Escalation</w:t>
+            </w:r>
+          </w:p>
+        </w:tc>
+        <w:tc>
+          <w:tcPr>
+            <w:tcW w:w="6747" w:type="dxa"/>
+            <w:vAlign w:val="top"/>
+          </w:tcPr>
+          <w:p>
+            <w:pPr>
+              <w:spacing w:before="40" w:after="40"/>
+            </w:pPr>
+            <w:r>
+              <w:rPr>
+                <w:sz w:val="19"/>
+                <w:szCs w:val="19"/>
+              </w:rPr>
+              <w:t xml:space="preserve">Compliance by department, approver, type or stage; escalation by level.</w:t>
+            </w:r>
+          </w:p>
+        </w:tc>
+      </w:tr>
+      <w:tr>
+        <w:tc>
+          <w:tcPr>
+            <w:tcW w:w="2891" w:type="dxa"/>
+            <w:vAlign w:val="top"/>
+          </w:tcPr>
+          <w:p>
+            <w:pPr>
+              <w:spacing w:before="40" w:after="40"/>
+            </w:pPr>
+            <w:r>
+              <w:rPr>
+                <w:b/>
+                <w:sz w:val="19"/>
+                <w:szCs w:val="19"/>
+              </w:rPr>
+              <w:t xml:space="preserve">Approver Performance</w:t>
+            </w:r>
+          </w:p>
+        </w:tc>
+        <w:tc>
+          <w:tcPr>
+            <w:tcW w:w="6747" w:type="dxa"/>
+            <w:vAlign w:val="top"/>
+          </w:tcPr>
+          <w:p>
+            <w:pPr>
+              <w:spacing w:before="40" w:after="40"/>
+            </w:pPr>
+            <w:r>
+              <w:rPr>
+                <w:sz w:val="19"/>
+                <w:szCs w:val="19"/>
+              </w:rPr>
+              <w:t xml:space="preserve">Per-person workflow metrics and rankings.</w:t>
+            </w:r>
+          </w:p>
+        </w:tc>
+      </w:tr>
+    </w:tbl>
+    <w:p>
+      <w:pPr>
+        <w:spacing w:after="120"/>
+      </w:pPr>
+    </w:p>
+    <w:p>
+      <w:pPr>
+        <w:pBdr>
+          <w:left w:val="single" w:sz="18" w:space="8" w:color="38BDF8"/>
+        </w:pBdr>
+        <w:shd w:val="clear" w:color="auto" w:fill="F0F9FF"/>
+        <w:spacing w:before="80" w:after="140"/>
+        <w:ind w:left="170"/>
+      </w:pPr>
+      <w:r>
+        <w:rPr>
+          <w:b/>
+          <w:color w:val="0369A1"/>
+        </w:rPr>
+        <w:t xml:space="preserve">Note   </w:t>
+      </w:r>
+      <w:r>
+        <w:rPr>
+          <w:color w:val="0C4A6E"/>
+        </w:rPr>
         <w:t xml:space="preserve">Two conventions worth knowing when reading any of them. Turnaround excludes time a step spent paused, so an approver is measured on the time they actually held the file. And a rate with nothing to divide shows a dash rather than 0% — a rate over no cases is unknown, not zero.</w:t>
       </w:r>
     </w:p>
@@ -6653,7 +7448,7 @@
         <w:rPr>
           <w:color w:val="64748B"/>
         </w:rPr>
-        <w:t xml:space="preserve">3.10   </w:t>
+        <w:t xml:space="preserve">3.11   </w:t>
       </w:r>
       <w:r>
         <w:t xml:space="preserve">Known gaps</w:t>

</xml_diff>

<commit_message>
feat: implement core e-approval domain logic, UI components, and service infrastructure
</commit_message>
<xml_diff>
--- a/docs/E-Approval-Manual.docx
+++ b/docs/E-Approval-Manual.docx
@@ -2817,7 +2817,22 @@
         <w:t xml:space="preserve">•</w:t>
       </w:r>
       <w:r>
-        <w:t xml:space="preserve">  An attachment is never overwritten. Uploading a revision adds a second file beside the original.</w:t>
+        <w:t xml:space="preserve">  While the approval is still your draft, you can remove a file you attached by mistake and attach the right one instead. Use the bin button on the file.</w:t>
+      </w:r>
+    </w:p>
+    <w:p>
+      <w:pPr>
+        <w:spacing w:after="60"/>
+        <w:ind w:left="400" w:hanging="280"/>
+      </w:pPr>
+      <w:r>
+        <w:rPr>
+          <w:b/>
+        </w:rPr>
+        <w:t xml:space="preserve">•</w:t>
+      </w:r>
+      <w:r>
+        <w:t xml:space="preserve">  Once submitted, an attachment is never overwritten. Uploading a corrected document adds a second file beside the original, marked Revision.</w:t>
       </w:r>
     </w:p>
     <w:p>
@@ -2845,7 +2860,30 @@
         <w:rPr>
           <w:color w:val="0C4A6E"/>
         </w:rPr>
-        <w:t xml:space="preserve">Nothing on an approval can be deleted once posted. That is what makes the file usable as evidence months later.</w:t>
+        <w:t xml:space="preserve">The removal window closes the moment you submit. After that an approver may have read the document, so replacing it has to leave both versions on the file — otherwise an approval given on page 3 of a quotation would end up pointing at a quotation nobody can produce.</w:t>
+      </w:r>
+    </w:p>
+    <w:p>
+      <w:pPr>
+        <w:pBdr>
+          <w:left w:val="single" w:sz="18" w:space="8" w:color="38BDF8"/>
+        </w:pBdr>
+        <w:shd w:val="clear" w:color="auto" w:fill="F0F9FF"/>
+        <w:spacing w:before="80" w:after="140"/>
+        <w:ind w:left="170"/>
+      </w:pPr>
+      <w:r>
+        <w:rPr>
+          <w:b/>
+          <w:color w:val="0369A1"/>
+        </w:rPr>
+        <w:t xml:space="preserve">Note   </w:t>
+      </w:r>
+      <w:r>
+        <w:rPr>
+          <w:color w:val="0C4A6E"/>
+        </w:rPr>
+        <w:t xml:space="preserve">Nothing else on an approval can be deleted once posted. That is what makes the file usable as evidence months later.</w:t>
       </w:r>
     </w:p>
     <w:p>

</xml_diff>